<commit_message>
rebuilding site 14 Jan 2022 15:17:44
</commit_message>
<xml_diff>
--- a/files/cv.docx
+++ b/files/cv.docx
@@ -605,25 +605,7 @@
                 <w:sz w:val="20"/>
                 <w:szCs w:val="20"/>
               </w:rPr>
-              <w:t>MA (</w:t>
-            </w:r>
-            <w:proofErr w:type="spellStart"/>
-            <w:r>
-              <w:rPr>
-                <w:rFonts w:ascii="Source Sans Pro" w:hAnsi="Source Sans Pro"/>
-                <w:sz w:val="20"/>
-                <w:szCs w:val="20"/>
-              </w:rPr>
-              <w:t>SocSci</w:t>
-            </w:r>
-            <w:proofErr w:type="spellEnd"/>
-            <w:r>
-              <w:rPr>
-                <w:rFonts w:ascii="Source Sans Pro" w:hAnsi="Source Sans Pro"/>
-                <w:sz w:val="20"/>
-                <w:szCs w:val="20"/>
-              </w:rPr>
-              <w:t>) in Psychology (1</w:t>
+              <w:t>MA (SocSci) in Psychology (1</w:t>
             </w:r>
             <w:r>
               <w:rPr>
@@ -954,25 +936,7 @@
                 <w:sz w:val="20"/>
                 <w:szCs w:val="20"/>
               </w:rPr>
-              <w:t xml:space="preserve">Supervised by Dr Joanna </w:t>
-            </w:r>
-            <w:proofErr w:type="spellStart"/>
-            <w:r>
-              <w:rPr>
-                <w:rFonts w:ascii="Source Sans Pro" w:hAnsi="Source Sans Pro"/>
-                <w:sz w:val="20"/>
-                <w:szCs w:val="20"/>
-              </w:rPr>
-              <w:t>Wincenciak</w:t>
-            </w:r>
-            <w:proofErr w:type="spellEnd"/>
-            <w:r>
-              <w:rPr>
-                <w:rFonts w:ascii="Source Sans Pro" w:hAnsi="Source Sans Pro"/>
-                <w:sz w:val="20"/>
-                <w:szCs w:val="20"/>
-              </w:rPr>
-              <w:t xml:space="preserve">. </w:t>
+              <w:t xml:space="preserve">Supervised by Dr Joanna Wincenciak. </w:t>
             </w:r>
             <w:r>
               <w:rPr>
@@ -1304,29 +1268,7 @@
           <w:szCs w:val="20"/>
           <w:lang w:eastAsia="en-GB"/>
         </w:rPr>
-        <w:t xml:space="preserve">Brief Report: Investigating the Motivations and Autistic Traits of Video Gamers. J Autism Dev </w:t>
-      </w:r>
-      <w:proofErr w:type="spellStart"/>
-      <w:r>
-        <w:rPr>
-          <w:rFonts w:ascii="Source Sans Pro" w:eastAsia="Times New Roman" w:hAnsi="Source Sans Pro" w:cstheme="minorHAnsi"/>
-          <w:b w:val="0"/>
-          <w:sz w:val="20"/>
-          <w:szCs w:val="20"/>
-          <w:lang w:eastAsia="en-GB"/>
-        </w:rPr>
-        <w:t>Disord</w:t>
-      </w:r>
-      <w:proofErr w:type="spellEnd"/>
-      <w:r>
-        <w:rPr>
-          <w:rFonts w:ascii="Source Sans Pro" w:eastAsia="Times New Roman" w:hAnsi="Source Sans Pro" w:cstheme="minorHAnsi"/>
-          <w:b w:val="0"/>
-          <w:sz w:val="20"/>
-          <w:szCs w:val="20"/>
-          <w:lang w:eastAsia="en-GB"/>
-        </w:rPr>
-        <w:t xml:space="preserve">. </w:t>
+        <w:t xml:space="preserve">Brief Report: Investigating the Motivations and Autistic Traits of Video Gamers. J Autism Dev Disord. </w:t>
       </w:r>
       <w:hyperlink r:id="rId11" w:history="1">
         <w:r>
@@ -1360,7 +1302,7 @@
           <w:szCs w:val="20"/>
           <w:lang w:eastAsia="en-GB"/>
         </w:rPr>
-        <w:t xml:space="preserve">Savickaite, S., McNaughton, K., Gaillard, E., Amaya, I., McDonnell, N., </w:t>
+        <w:t xml:space="preserve">Savickaite, S., </w:t>
       </w:r>
       <w:r>
         <w:rPr>
@@ -1380,9 +1322,80 @@
           <w:szCs w:val="20"/>
           <w:lang w:eastAsia="en-GB"/>
         </w:rPr>
+        <w:t>, Latkovskis, I., Failes, J., Kirkwood, N., &amp; McDonnell, N. (2022, January 11). Virtual Reality (VR) Multi-User Lab for Immersive Teaching.</w:t>
+      </w:r>
+      <w:r>
+        <w:rPr>
+          <w:rFonts w:ascii="Source Sans Pro" w:hAnsi="Source Sans Pro"/>
+          <w:sz w:val="20"/>
+          <w:szCs w:val="20"/>
+          <w:lang w:eastAsia="en-GB"/>
+        </w:rPr>
+        <w:br/>
+      </w:r>
+      <w:hyperlink r:id="rId12" w:history="1">
+        <w:r>
+          <w:rPr>
+            <w:rStyle w:val="Hyperlink"/>
+            <w:rFonts w:ascii="Source Sans Pro" w:hAnsi="Source Sans Pro"/>
+            <w:sz w:val="20"/>
+            <w:szCs w:val="20"/>
+            <w:lang w:eastAsia="en-GB"/>
+          </w:rPr>
+          <w:t>https://doi.org/10.31234/osf.io/3w4hv</w:t>
+        </w:r>
+      </w:hyperlink>
+      <w:r>
+        <w:rPr>
+          <w:rFonts w:ascii="Source Sans Pro" w:hAnsi="Source Sans Pro"/>
+          <w:sz w:val="20"/>
+          <w:szCs w:val="20"/>
+          <w:lang w:eastAsia="en-GB"/>
+        </w:rPr>
+        <w:t xml:space="preserve"> </w:t>
+      </w:r>
+    </w:p>
+    <w:p>
+      <w:pPr>
+        <w:spacing w:after="100" w:afterAutospacing="1" w:line="240" w:lineRule="auto"/>
+        <w:ind w:left="720" w:hanging="720"/>
+        <w:rPr>
+          <w:rFonts w:ascii="Source Sans Pro" w:hAnsi="Source Sans Pro"/>
+          <w:sz w:val="20"/>
+          <w:szCs w:val="20"/>
+          <w:lang w:eastAsia="en-GB"/>
+        </w:rPr>
+      </w:pPr>
+      <w:r>
+        <w:rPr>
+          <w:rFonts w:ascii="Source Sans Pro" w:hAnsi="Source Sans Pro"/>
+          <w:sz w:val="20"/>
+          <w:szCs w:val="20"/>
+          <w:lang w:eastAsia="en-GB"/>
+        </w:rPr>
+        <w:t xml:space="preserve">Savickaite, S., McNaughton, K., Gaillard, E., Amaya, I., McDonnell, N., </w:t>
+      </w:r>
+      <w:r>
+        <w:rPr>
+          <w:rFonts w:ascii="Source Sans Pro" w:hAnsi="Source Sans Pro"/>
+          <w:b/>
+          <w:bCs/>
+          <w:sz w:val="20"/>
+          <w:szCs w:val="20"/>
+          <w:lang w:eastAsia="en-GB"/>
+        </w:rPr>
+        <w:t>Millington, E.</w:t>
+      </w:r>
+      <w:r>
+        <w:rPr>
+          <w:rFonts w:ascii="Source Sans Pro" w:hAnsi="Source Sans Pro"/>
+          <w:sz w:val="20"/>
+          <w:szCs w:val="20"/>
+          <w:lang w:eastAsia="en-GB"/>
+        </w:rPr>
         <w:t xml:space="preserve">, &amp; Simmons, D. (2021, May 2). Using HMD Virtual Reality to investigate individual differences in visual processing styles. </w:t>
       </w:r>
-      <w:hyperlink r:id="rId12" w:history="1">
+      <w:hyperlink r:id="rId13" w:history="1">
         <w:r>
           <w:rPr>
             <w:rStyle w:val="Hyperlink"/>
@@ -1425,6 +1438,7 @@
           <w:szCs w:val="20"/>
           <w:lang w:eastAsia="en-GB"/>
         </w:rPr>
+        <w:lastRenderedPageBreak/>
         <w:t xml:space="preserve">Brown, L., </w:t>
       </w:r>
       <w:r>
@@ -1447,7 +1461,7 @@
         </w:rPr>
         <w:t xml:space="preserve">, Robertson, A. E., &amp; Simmons, D. (2021, April 27). Children’s Glasgow Sensory Questionnaire (C-GSQ): Validation of a Simplified and Visually Aided Questionnaire. </w:t>
       </w:r>
-      <w:hyperlink r:id="rId13" w:history="1">
+      <w:hyperlink r:id="rId14" w:history="1">
         <w:r>
           <w:rPr>
             <w:rStyle w:val="Hyperlink"/>
@@ -1632,7 +1646,6 @@
                 <w:sz w:val="20"/>
                 <w:szCs w:val="20"/>
               </w:rPr>
-              <w:lastRenderedPageBreak/>
               <w:t>201</w:t>
             </w:r>
             <w:r>
@@ -2578,23 +2591,13 @@
                 <w:szCs w:val="20"/>
               </w:rPr>
             </w:pPr>
-            <w:proofErr w:type="spellStart"/>
-            <w:r>
-              <w:rPr>
-                <w:rFonts w:ascii="Source Sans Pro" w:hAnsi="Source Sans Pro"/>
-                <w:sz w:val="20"/>
-                <w:szCs w:val="20"/>
-              </w:rPr>
-              <w:t>Creatovators</w:t>
-            </w:r>
-            <w:proofErr w:type="spellEnd"/>
-            <w:r>
-              <w:rPr>
-                <w:rFonts w:ascii="Source Sans Pro" w:hAnsi="Source Sans Pro"/>
-                <w:sz w:val="20"/>
-                <w:szCs w:val="20"/>
-              </w:rPr>
-              <w:t xml:space="preserve"> CIC</w:t>
+            <w:r>
+              <w:rPr>
+                <w:rFonts w:ascii="Source Sans Pro" w:hAnsi="Source Sans Pro"/>
+                <w:sz w:val="20"/>
+                <w:szCs w:val="20"/>
+              </w:rPr>
+              <w:t>Creatovators CIC</w:t>
             </w:r>
           </w:p>
         </w:tc>
@@ -2795,6 +2798,7 @@
           <w:sz w:val="20"/>
           <w:szCs w:val="20"/>
         </w:rPr>
+        <w:lastRenderedPageBreak/>
         <w:t>Professional Affiliations</w:t>
       </w:r>
     </w:p>
@@ -3003,33 +3007,6 @@
               </w:rPr>
               <w:t>Student Member of the International Society for Autism Research</w:t>
             </w:r>
-            <w:r>
-              <w:rPr>
-                <w:rFonts w:ascii="Source Sans Pro" w:hAnsi="Source Sans Pro"/>
-                <w:sz w:val="20"/>
-                <w:szCs w:val="20"/>
-              </w:rPr>
-              <w:tab/>
-            </w:r>
-          </w:p>
-          <w:p>
-            <w:pPr>
-              <w:rPr>
-                <w:rFonts w:ascii="Source Sans Pro" w:hAnsi="Source Sans Pro"/>
-                <w:sz w:val="20"/>
-                <w:szCs w:val="20"/>
-              </w:rPr>
-            </w:pPr>
-          </w:p>
-          <w:p>
-            <w:pPr>
-              <w:jc w:val="right"/>
-              <w:rPr>
-                <w:rFonts w:ascii="Source Sans Pro" w:hAnsi="Source Sans Pro"/>
-                <w:sz w:val="20"/>
-                <w:szCs w:val="20"/>
-              </w:rPr>
-            </w:pPr>
           </w:p>
         </w:tc>
       </w:tr>
@@ -3049,7 +3026,6 @@
           <w:sz w:val="20"/>
           <w:szCs w:val="20"/>
         </w:rPr>
-        <w:lastRenderedPageBreak/>
         <w:t>R</w:t>
       </w:r>
       <w:r>
@@ -3187,7 +3163,7 @@
         </w:rPr>
         <w:br/>
       </w:r>
-      <w:hyperlink r:id="rId14" w:history="1">
+      <w:hyperlink r:id="rId15" w:history="1">
         <w:r>
           <w:rPr>
             <w:rStyle w:val="Hyperlink"/>
@@ -3261,7 +3237,7 @@
         </w:rPr>
         <w:br/>
       </w:r>
-      <w:hyperlink r:id="rId15" w:history="1">
+      <w:hyperlink r:id="rId16" w:history="1">
         <w:r>
           <w:rPr>
             <w:rStyle w:val="Hyperlink"/>
@@ -3366,7 +3342,7 @@
         </w:rPr>
         <w:br/>
       </w:r>
-      <w:hyperlink r:id="rId16" w:history="1">
+      <w:hyperlink r:id="rId17" w:history="1">
         <w:r>
           <w:rPr>
             <w:rStyle w:val="Hyperlink"/>
@@ -3379,7 +3355,7 @@
       </w:hyperlink>
     </w:p>
     <w:sectPr>
-      <w:footerReference w:type="default" r:id="rId17"/>
+      <w:footerReference w:type="default" r:id="rId18"/>
       <w:pgSz w:w="11906" w:h="16838"/>
       <w:pgMar w:top="1440" w:right="1440" w:bottom="1440" w:left="1440" w:header="708" w:footer="708" w:gutter="0"/>
       <w:cols w:space="708"/>
@@ -4805,10 +4781,6 @@
 </file>
 
 <file path=customXml/item1.xml><?xml version="1.0" encoding="utf-8"?>
-<b:Sources xmlns:b="http://schemas.openxmlformats.org/officeDocument/2006/bibliography" xmlns="http://schemas.openxmlformats.org/officeDocument/2006/bibliography" SelectedStyle="\APASixthEditionOfficeOnline.xsl" StyleName="APA" Version="6"/>
-</file>
-
-<file path=customXml/item2.xml><?xml version="1.0" encoding="utf-8"?>
 <?mso-contentType ?>
 <FormTemplates xmlns="http://schemas.microsoft.com/sharepoint/v3/contenttype/forms">
   <Display>DocumentLibraryForm</Display>
@@ -4817,13 +4789,11 @@
 </FormTemplates>
 </file>
 
-<file path=customXml/item3.xml><?xml version="1.0" encoding="utf-8"?>
-<p:properties xmlns:p="http://schemas.microsoft.com/office/2006/metadata/properties" xmlns:xsi="http://www.w3.org/2001/XMLSchema-instance" xmlns:pc="http://schemas.microsoft.com/office/infopath/2007/PartnerControls">
-  <documentManagement/>
-</p:properties>
+<file path=customXml/item2.xml><?xml version="1.0" encoding="utf-8"?>
+<b:Sources xmlns:b="http://schemas.openxmlformats.org/officeDocument/2006/bibliography" xmlns="http://schemas.openxmlformats.org/officeDocument/2006/bibliography" SelectedStyle="\APASixthEditionOfficeOnline.xsl" StyleName="APA" Version="6"/>
 </file>
 
-<file path=customXml/item4.xml><?xml version="1.0" encoding="utf-8"?>
+<file path=customXml/item3.xml><?xml version="1.0" encoding="utf-8"?>
 <ct:contentTypeSchema xmlns:ct="http://schemas.microsoft.com/office/2006/metadata/contentType" xmlns:ma="http://schemas.microsoft.com/office/2006/metadata/properties/metaAttributes" ct:_="" ma:_="" ma:contentTypeName="Document" ma:contentTypeID="0x0101004E0AC046D158EE4DB937DA9A56D27D1C" ma:contentTypeVersion="10" ma:contentTypeDescription="Create a new document." ma:contentTypeScope="" ma:versionID="f1b105e6b9cff91feb409560dbf6f7aa">
   <xsd:schema xmlns:xsd="http://www.w3.org/2001/XMLSchema" xmlns:xs="http://www.w3.org/2001/XMLSchema" xmlns:p="http://schemas.microsoft.com/office/2006/metadata/properties" xmlns:ns3="b24ac480-a0b1-4388-a6cd-cfb001cdf6c7" xmlns:ns4="e7d8f92c-3952-4b7d-acc4-88cf8f2f7888" targetNamespace="http://schemas.microsoft.com/office/2006/metadata/properties" ma:root="true" ma:fieldsID="8ce9a1263d385fff90f75fc0f277280b" ns3:_="" ns4:_="">
     <xsd:import namespace="b24ac480-a0b1-4388-a6cd-cfb001cdf6c7"/>
@@ -5026,7 +4996,21 @@
 </ct:contentTypeSchema>
 </file>
 
+<file path=customXml/item4.xml><?xml version="1.0" encoding="utf-8"?>
+<p:properties xmlns:p="http://schemas.microsoft.com/office/2006/metadata/properties" xmlns:xsi="http://www.w3.org/2001/XMLSchema-instance" xmlns:pc="http://schemas.microsoft.com/office/infopath/2007/PartnerControls">
+  <documentManagement/>
+</p:properties>
+</file>
+
 <file path=customXml/itemProps1.xml><?xml version="1.0" encoding="utf-8"?>
+<ds:datastoreItem xmlns:ds="http://schemas.openxmlformats.org/officeDocument/2006/customXml" ds:itemID="{4C53A478-4862-4699-9810-166E8FEE5B0D}">
+  <ds:schemaRefs>
+    <ds:schemaRef ds:uri="http://schemas.microsoft.com/sharepoint/v3/contenttype/forms"/>
+  </ds:schemaRefs>
+</ds:datastoreItem>
+</file>
+
+<file path=customXml/itemProps2.xml><?xml version="1.0" encoding="utf-8"?>
 <ds:datastoreItem xmlns:ds="http://schemas.openxmlformats.org/officeDocument/2006/customXml" ds:itemID="{A9BA2174-033C-45ED-94FB-74A1FBFA3035}">
   <ds:schemaRefs>
     <ds:schemaRef ds:uri="http://schemas.openxmlformats.org/officeDocument/2006/bibliography"/>
@@ -5034,24 +5018,7 @@
 </ds:datastoreItem>
 </file>
 
-<file path=customXml/itemProps2.xml><?xml version="1.0" encoding="utf-8"?>
-<ds:datastoreItem xmlns:ds="http://schemas.openxmlformats.org/officeDocument/2006/customXml" ds:itemID="{4C53A478-4862-4699-9810-166E8FEE5B0D}">
-  <ds:schemaRefs>
-    <ds:schemaRef ds:uri="http://schemas.microsoft.com/sharepoint/v3/contenttype/forms"/>
-  </ds:schemaRefs>
-</ds:datastoreItem>
-</file>
-
 <file path=customXml/itemProps3.xml><?xml version="1.0" encoding="utf-8"?>
-<ds:datastoreItem xmlns:ds="http://schemas.openxmlformats.org/officeDocument/2006/customXml" ds:itemID="{DD97F3C8-62EE-4BC5-A92B-F4DA5CE92DF8}">
-  <ds:schemaRefs>
-    <ds:schemaRef ds:uri="http://schemas.microsoft.com/office/2006/metadata/properties"/>
-    <ds:schemaRef ds:uri="http://schemas.microsoft.com/office/infopath/2007/PartnerControls"/>
-  </ds:schemaRefs>
-</ds:datastoreItem>
-</file>
-
-<file path=customXml/itemProps4.xml><?xml version="1.0" encoding="utf-8"?>
 <ds:datastoreItem xmlns:ds="http://schemas.openxmlformats.org/officeDocument/2006/customXml" ds:itemID="{11E413AD-A691-4C16-BEE5-5C367C5D236C}">
   <ds:schemaRefs>
     <ds:schemaRef ds:uri="http://schemas.microsoft.com/office/2006/metadata/contentType"/>
@@ -5068,4 +5035,13 @@
     <ds:schemaRef ds:uri="http://schemas.microsoft.com/internal/obd"/>
   </ds:schemaRefs>
 </ds:datastoreItem>
+</file>
+
+<file path=customXml/itemProps4.xml><?xml version="1.0" encoding="utf-8"?>
+<ds:datastoreItem xmlns:ds="http://schemas.openxmlformats.org/officeDocument/2006/customXml" ds:itemID="{DD97F3C8-62EE-4BC5-A92B-F4DA5CE92DF8}">
+  <ds:schemaRefs>
+    <ds:schemaRef ds:uri="http://schemas.microsoft.com/office/2006/metadata/properties"/>
+    <ds:schemaRef ds:uri="http://schemas.microsoft.com/office/infopath/2007/PartnerControls"/>
+  </ds:schemaRefs>
+</ds:datastoreItem>
 </file>
</xml_diff>

<commit_message>
Updated Visual Processing publication from preprint to article
</commit_message>
<xml_diff>
--- a/files/cv.docx
+++ b/files/cv.docx
@@ -605,7 +605,25 @@
                 <w:sz w:val="20"/>
                 <w:szCs w:val="20"/>
               </w:rPr>
-              <w:t>MA (SocSci) in Psychology (1</w:t>
+              <w:t>MA (</w:t>
+            </w:r>
+            <w:proofErr w:type="spellStart"/>
+            <w:r>
+              <w:rPr>
+                <w:rFonts w:ascii="Source Sans Pro" w:hAnsi="Source Sans Pro"/>
+                <w:sz w:val="20"/>
+                <w:szCs w:val="20"/>
+              </w:rPr>
+              <w:t>SocSci</w:t>
+            </w:r>
+            <w:proofErr w:type="spellEnd"/>
+            <w:r>
+              <w:rPr>
+                <w:rFonts w:ascii="Source Sans Pro" w:hAnsi="Source Sans Pro"/>
+                <w:sz w:val="20"/>
+                <w:szCs w:val="20"/>
+              </w:rPr>
+              <w:t>) in Psychology (1</w:t>
             </w:r>
             <w:r>
               <w:rPr>
@@ -936,7 +954,25 @@
                 <w:sz w:val="20"/>
                 <w:szCs w:val="20"/>
               </w:rPr>
-              <w:t xml:space="preserve">Supervised by Dr Joanna Wincenciak. </w:t>
+              <w:t xml:space="preserve">Supervised by Dr Joanna </w:t>
+            </w:r>
+            <w:proofErr w:type="spellStart"/>
+            <w:r>
+              <w:rPr>
+                <w:rFonts w:ascii="Source Sans Pro" w:hAnsi="Source Sans Pro"/>
+                <w:sz w:val="20"/>
+                <w:szCs w:val="20"/>
+              </w:rPr>
+              <w:t>Wincenciak</w:t>
+            </w:r>
+            <w:proofErr w:type="spellEnd"/>
+            <w:r>
+              <w:rPr>
+                <w:rFonts w:ascii="Source Sans Pro" w:hAnsi="Source Sans Pro"/>
+                <w:sz w:val="20"/>
+                <w:szCs w:val="20"/>
+              </w:rPr>
+              <w:t xml:space="preserve">. </w:t>
             </w:r>
             <w:r>
               <w:rPr>
@@ -1258,7 +1294,7 @@
           <w:szCs w:val="20"/>
           <w:lang w:eastAsia="en-GB"/>
         </w:rPr>
-        <w:t xml:space="preserve">(2021). </w:t>
+        <w:t>(202</w:t>
       </w:r>
       <w:r>
         <w:rPr>
@@ -1268,7 +1304,96 @@
           <w:szCs w:val="20"/>
           <w:lang w:eastAsia="en-GB"/>
         </w:rPr>
-        <w:t xml:space="preserve">Brief Report: Investigating the Motivations and Autistic Traits of Video Gamers. J Autism Dev Disord. </w:t>
+        <w:t>2</w:t>
+      </w:r>
+      <w:r>
+        <w:rPr>
+          <w:rFonts w:ascii="Source Sans Pro" w:eastAsia="Times New Roman" w:hAnsi="Source Sans Pro" w:cstheme="minorHAnsi"/>
+          <w:b w:val="0"/>
+          <w:sz w:val="20"/>
+          <w:szCs w:val="20"/>
+          <w:lang w:eastAsia="en-GB"/>
+        </w:rPr>
+        <w:t xml:space="preserve">). </w:t>
+      </w:r>
+      <w:r>
+        <w:rPr>
+          <w:rFonts w:ascii="Source Sans Pro" w:eastAsia="Times New Roman" w:hAnsi="Source Sans Pro" w:cstheme="minorHAnsi"/>
+          <w:b w:val="0"/>
+          <w:sz w:val="20"/>
+          <w:szCs w:val="20"/>
+          <w:lang w:eastAsia="en-GB"/>
+        </w:rPr>
+        <w:t>Brief Report: Investigating the Motivations and Autistic Traits of Video Gamers.</w:t>
+      </w:r>
+      <w:r>
+        <w:t xml:space="preserve"> </w:t>
+      </w:r>
+      <w:r>
+        <w:rPr>
+          <w:rFonts w:ascii="Source Sans Pro" w:eastAsia="Times New Roman" w:hAnsi="Source Sans Pro" w:cstheme="minorHAnsi"/>
+          <w:b w:val="0"/>
+          <w:i/>
+          <w:iCs/>
+          <w:sz w:val="20"/>
+          <w:szCs w:val="20"/>
+          <w:lang w:eastAsia="en-GB"/>
+        </w:rPr>
+        <w:t xml:space="preserve">J Autism Dev </w:t>
+      </w:r>
+      <w:proofErr w:type="spellStart"/>
+      <w:r>
+        <w:rPr>
+          <w:rFonts w:ascii="Source Sans Pro" w:eastAsia="Times New Roman" w:hAnsi="Source Sans Pro" w:cstheme="minorHAnsi"/>
+          <w:b w:val="0"/>
+          <w:i/>
+          <w:iCs/>
+          <w:sz w:val="20"/>
+          <w:szCs w:val="20"/>
+          <w:lang w:eastAsia="en-GB"/>
+        </w:rPr>
+        <w:t>Disord</w:t>
+      </w:r>
+      <w:proofErr w:type="spellEnd"/>
+      <w:r>
+        <w:rPr>
+          <w:rFonts w:ascii="Source Sans Pro" w:eastAsia="Times New Roman" w:hAnsi="Source Sans Pro" w:cstheme="minorHAnsi"/>
+          <w:b w:val="0"/>
+          <w:sz w:val="20"/>
+          <w:szCs w:val="20"/>
+          <w:lang w:eastAsia="en-GB"/>
+        </w:rPr>
+        <w:t xml:space="preserve"> 52, </w:t>
+      </w:r>
+      <w:r>
+        <w:rPr>
+          <w:rFonts w:ascii="Source Sans Pro" w:eastAsia="Times New Roman" w:hAnsi="Source Sans Pro" w:cstheme="minorHAnsi"/>
+          <w:b w:val="0"/>
+          <w:sz w:val="20"/>
+          <w:szCs w:val="20"/>
+          <w:lang w:eastAsia="en-GB"/>
+        </w:rPr>
+        <w:t xml:space="preserve">pp </w:t>
+      </w:r>
+      <w:r>
+        <w:rPr>
+          <w:rFonts w:ascii="Source Sans Pro" w:eastAsia="Times New Roman" w:hAnsi="Source Sans Pro" w:cstheme="minorHAnsi"/>
+          <w:b w:val="0"/>
+          <w:sz w:val="20"/>
+          <w:szCs w:val="20"/>
+          <w:lang w:eastAsia="en-GB"/>
+        </w:rPr>
+        <w:t xml:space="preserve">1403–1407 </w:t>
+      </w:r>
+      <w:r>
+        <w:rPr>
+          <w:rFonts w:ascii="Source Sans Pro" w:eastAsia="Times New Roman" w:hAnsi="Source Sans Pro" w:cstheme="minorHAnsi"/>
+          <w:b w:val="0"/>
+          <w:sz w:val="20"/>
+          <w:szCs w:val="20"/>
+          <w:lang w:eastAsia="en-GB"/>
+        </w:rPr>
+        <w:t xml:space="preserve"> </w:t>
       </w:r>
       <w:hyperlink r:id="rId11" w:history="1">
         <w:r>
@@ -1322,7 +1447,27 @@
           <w:szCs w:val="20"/>
           <w:lang w:eastAsia="en-GB"/>
         </w:rPr>
-        <w:t>, Latkovskis, I., Failes, J., Kirkwood, N., &amp; McDonnell, N. (2022, January 11). Virtual Reality (VR) Multi-User Lab for Immersive Teaching.</w:t>
+        <w:t xml:space="preserve">, </w:t>
+      </w:r>
+      <w:proofErr w:type="spellStart"/>
+      <w:r>
+        <w:rPr>
+          <w:rFonts w:ascii="Source Sans Pro" w:hAnsi="Source Sans Pro"/>
+          <w:sz w:val="20"/>
+          <w:szCs w:val="20"/>
+          <w:lang w:eastAsia="en-GB"/>
+        </w:rPr>
+        <w:t>Latkovskis</w:t>
+      </w:r>
+      <w:proofErr w:type="spellEnd"/>
+      <w:r>
+        <w:rPr>
+          <w:rFonts w:ascii="Source Sans Pro" w:hAnsi="Source Sans Pro"/>
+          <w:sz w:val="20"/>
+          <w:szCs w:val="20"/>
+          <w:lang w:eastAsia="en-GB"/>
+        </w:rPr>
+        <w:t>, I., Failes, J., Kirkwood, N., &amp; McDonnell, N. (2022, January 11). Virtual Reality (VR) Multi-User Lab for Immersive Teaching.</w:t>
       </w:r>
       <w:r>
         <w:rPr>
@@ -1393,7 +1538,45 @@
           <w:szCs w:val="20"/>
           <w:lang w:eastAsia="en-GB"/>
         </w:rPr>
-        <w:t xml:space="preserve">, &amp; Simmons, D. (2021, May 2). Using HMD Virtual Reality to investigate individual differences in visual processing styles. </w:t>
+        <w:t xml:space="preserve">, &amp; Simmons, D. (2021). </w:t>
+      </w:r>
+      <w:r>
+        <w:rPr>
+          <w:rFonts w:ascii="Source Sans Pro" w:hAnsi="Source Sans Pro"/>
+          <w:sz w:val="20"/>
+          <w:szCs w:val="20"/>
+          <w:lang w:eastAsia="en-GB"/>
+        </w:rPr>
+        <w:t>Exploratory study on the use of HMD virtual reality to investigate individual differences in visual processing styles</w:t>
+      </w:r>
+      <w:r>
+        <w:rPr>
+          <w:rFonts w:ascii="Source Sans Pro" w:hAnsi="Source Sans Pro"/>
+          <w:sz w:val="20"/>
+          <w:szCs w:val="20"/>
+          <w:lang w:eastAsia="en-GB"/>
+        </w:rPr>
+        <w:t xml:space="preserve">. </w:t>
+      </w:r>
+      <w:r>
+        <w:rPr>
+          <w:rFonts w:ascii="Source Sans Pro" w:hAnsi="Source Sans Pro"/>
+          <w:i/>
+          <w:iCs/>
+          <w:sz w:val="20"/>
+          <w:szCs w:val="20"/>
+          <w:lang w:eastAsia="en-GB"/>
+        </w:rPr>
+        <w:t>Journal of Enabling Technologies</w:t>
+      </w:r>
+      <w:r>
+        <w:rPr>
+          <w:rFonts w:ascii="Source Sans Pro" w:hAnsi="Source Sans Pro"/>
+          <w:sz w:val="20"/>
+          <w:szCs w:val="20"/>
+          <w:lang w:eastAsia="en-GB"/>
+        </w:rPr>
+        <w:t xml:space="preserve">, 16, pp. 48-69. </w:t>
       </w:r>
       <w:hyperlink r:id="rId13" w:history="1">
         <w:r>
@@ -1404,7 +1587,7 @@
             <w:szCs w:val="20"/>
             <w:lang w:eastAsia="en-GB"/>
           </w:rPr>
-          <w:t>https://doi.org/10.31234/osf.io/g7d9c</w:t>
+          <w:t>https://doi.org/10.1108/JET-06-2021-0028</w:t>
         </w:r>
       </w:hyperlink>
       <w:r>
@@ -2591,13 +2774,23 @@
                 <w:szCs w:val="20"/>
               </w:rPr>
             </w:pPr>
-            <w:r>
-              <w:rPr>
-                <w:rFonts w:ascii="Source Sans Pro" w:hAnsi="Source Sans Pro"/>
-                <w:sz w:val="20"/>
-                <w:szCs w:val="20"/>
-              </w:rPr>
-              <w:t>Creatovators CIC</w:t>
+            <w:proofErr w:type="spellStart"/>
+            <w:r>
+              <w:rPr>
+                <w:rFonts w:ascii="Source Sans Pro" w:hAnsi="Source Sans Pro"/>
+                <w:sz w:val="20"/>
+                <w:szCs w:val="20"/>
+              </w:rPr>
+              <w:t>Creatovators</w:t>
+            </w:r>
+            <w:proofErr w:type="spellEnd"/>
+            <w:r>
+              <w:rPr>
+                <w:rFonts w:ascii="Source Sans Pro" w:hAnsi="Source Sans Pro"/>
+                <w:sz w:val="20"/>
+                <w:szCs w:val="20"/>
+              </w:rPr>
+              <w:t xml:space="preserve"> CIC</w:t>
             </w:r>
           </w:p>
         </w:tc>
@@ -2713,15 +2906,7 @@
                 <w:sz w:val="20"/>
                 <w:szCs w:val="20"/>
               </w:rPr>
-              <w:t>p</w:t>
-            </w:r>
-            <w:r>
-              <w:rPr>
-                <w:rFonts w:ascii="Source Sans Pro" w:hAnsi="Source Sans Pro"/>
-                <w:sz w:val="20"/>
-                <w:szCs w:val="20"/>
-              </w:rPr>
-              <w:t>resent</w:t>
+              <w:t>2021</w:t>
             </w:r>
           </w:p>
         </w:tc>
@@ -3867,10 +4052,10 @@
       </w:rPr>
     </w:lvl>
   </w:abstractNum>
-  <w:num w:numId="1">
+  <w:num w:numId="1" w16cid:durableId="220989245">
     <w:abstractNumId w:val="0"/>
   </w:num>
-  <w:num w:numId="2">
+  <w:num w:numId="2" w16cid:durableId="1188257858">
     <w:abstractNumId w:val="1"/>
   </w:num>
 </w:numbering>
@@ -4781,6 +4966,12 @@
 </file>
 
 <file path=customXml/item1.xml><?xml version="1.0" encoding="utf-8"?>
+<p:properties xmlns:p="http://schemas.microsoft.com/office/2006/metadata/properties" xmlns:xsi="http://www.w3.org/2001/XMLSchema-instance" xmlns:pc="http://schemas.microsoft.com/office/infopath/2007/PartnerControls">
+  <documentManagement/>
+</p:properties>
+</file>
+
+<file path=customXml/item2.xml><?xml version="1.0" encoding="utf-8"?>
 <?mso-contentType ?>
 <FormTemplates xmlns="http://schemas.microsoft.com/sharepoint/v3/contenttype/forms">
   <Display>DocumentLibraryForm</Display>
@@ -4789,11 +4980,11 @@
 </FormTemplates>
 </file>
 
-<file path=customXml/item2.xml><?xml version="1.0" encoding="utf-8"?>
+<file path=customXml/item3.xml><?xml version="1.0" encoding="utf-8"?>
 <b:Sources xmlns:b="http://schemas.openxmlformats.org/officeDocument/2006/bibliography" xmlns="http://schemas.openxmlformats.org/officeDocument/2006/bibliography" SelectedStyle="\APASixthEditionOfficeOnline.xsl" StyleName="APA" Version="6"/>
 </file>
 
-<file path=customXml/item3.xml><?xml version="1.0" encoding="utf-8"?>
+<file path=customXml/item4.xml><?xml version="1.0" encoding="utf-8"?>
 <ct:contentTypeSchema xmlns:ct="http://schemas.microsoft.com/office/2006/metadata/contentType" xmlns:ma="http://schemas.microsoft.com/office/2006/metadata/properties/metaAttributes" ct:_="" ma:_="" ma:contentTypeName="Document" ma:contentTypeID="0x0101004E0AC046D158EE4DB937DA9A56D27D1C" ma:contentTypeVersion="10" ma:contentTypeDescription="Create a new document." ma:contentTypeScope="" ma:versionID="f1b105e6b9cff91feb409560dbf6f7aa">
   <xsd:schema xmlns:xsd="http://www.w3.org/2001/XMLSchema" xmlns:xs="http://www.w3.org/2001/XMLSchema" xmlns:p="http://schemas.microsoft.com/office/2006/metadata/properties" xmlns:ns3="b24ac480-a0b1-4388-a6cd-cfb001cdf6c7" xmlns:ns4="e7d8f92c-3952-4b7d-acc4-88cf8f2f7888" targetNamespace="http://schemas.microsoft.com/office/2006/metadata/properties" ma:root="true" ma:fieldsID="8ce9a1263d385fff90f75fc0f277280b" ns3:_="" ns4:_="">
     <xsd:import namespace="b24ac480-a0b1-4388-a6cd-cfb001cdf6c7"/>
@@ -4996,13 +5187,16 @@
 </ct:contentTypeSchema>
 </file>
 
-<file path=customXml/item4.xml><?xml version="1.0" encoding="utf-8"?>
-<p:properties xmlns:p="http://schemas.microsoft.com/office/2006/metadata/properties" xmlns:xsi="http://www.w3.org/2001/XMLSchema-instance" xmlns:pc="http://schemas.microsoft.com/office/infopath/2007/PartnerControls">
-  <documentManagement/>
-</p:properties>
+<file path=customXml/itemProps1.xml><?xml version="1.0" encoding="utf-8"?>
+<ds:datastoreItem xmlns:ds="http://schemas.openxmlformats.org/officeDocument/2006/customXml" ds:itemID="{DD97F3C8-62EE-4BC5-A92B-F4DA5CE92DF8}">
+  <ds:schemaRefs>
+    <ds:schemaRef ds:uri="http://schemas.microsoft.com/office/2006/metadata/properties"/>
+    <ds:schemaRef ds:uri="http://schemas.microsoft.com/office/infopath/2007/PartnerControls"/>
+  </ds:schemaRefs>
+</ds:datastoreItem>
 </file>
 
-<file path=customXml/itemProps1.xml><?xml version="1.0" encoding="utf-8"?>
+<file path=customXml/itemProps2.xml><?xml version="1.0" encoding="utf-8"?>
 <ds:datastoreItem xmlns:ds="http://schemas.openxmlformats.org/officeDocument/2006/customXml" ds:itemID="{4C53A478-4862-4699-9810-166E8FEE5B0D}">
   <ds:schemaRefs>
     <ds:schemaRef ds:uri="http://schemas.microsoft.com/sharepoint/v3/contenttype/forms"/>
@@ -5010,7 +5204,7 @@
 </ds:datastoreItem>
 </file>
 
-<file path=customXml/itemProps2.xml><?xml version="1.0" encoding="utf-8"?>
+<file path=customXml/itemProps3.xml><?xml version="1.0" encoding="utf-8"?>
 <ds:datastoreItem xmlns:ds="http://schemas.openxmlformats.org/officeDocument/2006/customXml" ds:itemID="{A9BA2174-033C-45ED-94FB-74A1FBFA3035}">
   <ds:schemaRefs>
     <ds:schemaRef ds:uri="http://schemas.openxmlformats.org/officeDocument/2006/bibliography"/>
@@ -5018,7 +5212,7 @@
 </ds:datastoreItem>
 </file>
 
-<file path=customXml/itemProps3.xml><?xml version="1.0" encoding="utf-8"?>
+<file path=customXml/itemProps4.xml><?xml version="1.0" encoding="utf-8"?>
 <ds:datastoreItem xmlns:ds="http://schemas.openxmlformats.org/officeDocument/2006/customXml" ds:itemID="{11E413AD-A691-4C16-BEE5-5C367C5D236C}">
   <ds:schemaRefs>
     <ds:schemaRef ds:uri="http://schemas.microsoft.com/office/2006/metadata/contentType"/>
@@ -5035,13 +5229,4 @@
     <ds:schemaRef ds:uri="http://schemas.microsoft.com/internal/obd"/>
   </ds:schemaRefs>
 </ds:datastoreItem>
-</file>
-
-<file path=customXml/itemProps4.xml><?xml version="1.0" encoding="utf-8"?>
-<ds:datastoreItem xmlns:ds="http://schemas.openxmlformats.org/officeDocument/2006/customXml" ds:itemID="{DD97F3C8-62EE-4BC5-A92B-F4DA5CE92DF8}">
-  <ds:schemaRefs>
-    <ds:schemaRef ds:uri="http://schemas.microsoft.com/office/2006/metadata/properties"/>
-    <ds:schemaRef ds:uri="http://schemas.microsoft.com/office/infopath/2007/PartnerControls"/>
-  </ds:schemaRefs>
-</ds:datastoreItem>
 </file>
</xml_diff>

<commit_message>
Updated CV and profile image
</commit_message>
<xml_diff>
--- a/files/cv.docx
+++ b/files/cv.docx
@@ -1537,7 +1537,6 @@
         </w:rPr>
         <w:t xml:space="preserve">, </w:t>
       </w:r>
-      <w:proofErr w:type="spellStart"/>
       <w:r>
         <w:rPr>
           <w:rFonts w:ascii="Source Sans Pro" w:hAnsi="Source Sans Pro"/>
@@ -1545,29 +1544,12 @@
         </w:rPr>
         <w:t>Hayashibara</w:t>
       </w:r>
-      <w:proofErr w:type="spellEnd"/>
       <w:r>
         <w:rPr>
           <w:rFonts w:ascii="Source Sans Pro" w:hAnsi="Source Sans Pro"/>
           <w:lang w:eastAsia="en-GB"/>
         </w:rPr>
-        <w:t xml:space="preserve">, E., Arthur, T., </w:t>
-      </w:r>
-      <w:proofErr w:type="spellStart"/>
-      <w:r>
-        <w:rPr>
-          <w:rFonts w:ascii="Source Sans Pro" w:hAnsi="Source Sans Pro"/>
-          <w:lang w:eastAsia="en-GB"/>
-        </w:rPr>
-        <w:t>Husselman</w:t>
-      </w:r>
-      <w:proofErr w:type="spellEnd"/>
-      <w:r>
-        <w:rPr>
-          <w:rFonts w:ascii="Source Sans Pro" w:hAnsi="Source Sans Pro"/>
-          <w:lang w:eastAsia="en-GB"/>
-        </w:rPr>
-        <w:t xml:space="preserve">, T., Savickaite, S., Taylor, R. (In Submission). </w:t>
+        <w:t xml:space="preserve">, E., Arthur, T., Husselman, T., Savickaite, S., Taylor, R. (In Submission). </w:t>
       </w:r>
       <w:r>
         <w:rPr>
@@ -1637,33 +1619,15 @@
           <w:rFonts w:ascii="Source Sans Pro" w:hAnsi="Source Sans Pro"/>
           <w:lang w:eastAsia="en-GB"/>
         </w:rPr>
-        <w:t xml:space="preserve">, </w:t>
-      </w:r>
-      <w:proofErr w:type="spellStart"/>
+        <w:t xml:space="preserve">, Husselman, T., Taylor, R., </w:t>
+      </w:r>
       <w:r>
         <w:rPr>
           <w:rFonts w:ascii="Source Sans Pro" w:hAnsi="Source Sans Pro"/>
           <w:lang w:eastAsia="en-GB"/>
         </w:rPr>
-        <w:t>Husselman</w:t>
-      </w:r>
-      <w:proofErr w:type="spellEnd"/>
-      <w:r>
-        <w:rPr>
-          <w:rFonts w:ascii="Source Sans Pro" w:hAnsi="Source Sans Pro"/>
-          <w:lang w:eastAsia="en-GB"/>
-        </w:rPr>
-        <w:t xml:space="preserve">, T., Taylor, R., </w:t>
-      </w:r>
-      <w:proofErr w:type="spellStart"/>
-      <w:r>
-        <w:rPr>
-          <w:rFonts w:ascii="Source Sans Pro" w:hAnsi="Source Sans Pro"/>
-          <w:lang w:eastAsia="en-GB"/>
-        </w:rPr>
         <w:t>Hayashibara</w:t>
       </w:r>
-      <w:proofErr w:type="spellEnd"/>
       <w:r>
         <w:rPr>
           <w:rFonts w:ascii="Source Sans Pro" w:hAnsi="Source Sans Pro"/>
@@ -1756,6 +1720,44 @@
               <w:rPr>
                 <w:rFonts w:ascii="Source Sans Pro" w:hAnsi="Source Sans Pro"/>
               </w:rPr>
+              <w:t>2022</w:t>
+            </w:r>
+          </w:p>
+        </w:tc>
+        <w:tc>
+          <w:tcPr>
+            <w:tcW w:w="7485" w:type="dxa"/>
+          </w:tcPr>
+          <w:p>
+            <w:pPr>
+              <w:rPr>
+                <w:rFonts w:ascii="Source Sans Pro" w:hAnsi="Source Sans Pro"/>
+              </w:rPr>
+            </w:pPr>
+            <w:r>
+              <w:rPr>
+                <w:rFonts w:ascii="Source Sans Pro" w:hAnsi="Source Sans Pro"/>
+              </w:rPr>
+              <w:t>Immersive Learning Research Network Award for Innovative Pedagogy</w:t>
+            </w:r>
+          </w:p>
+        </w:tc>
+      </w:tr>
+      <w:tr>
+        <w:tc>
+          <w:tcPr>
+            <w:tcW w:w="1588" w:type="dxa"/>
+          </w:tcPr>
+          <w:p>
+            <w:pPr>
+              <w:rPr>
+                <w:rFonts w:ascii="Source Sans Pro" w:hAnsi="Source Sans Pro"/>
+              </w:rPr>
+            </w:pPr>
+            <w:r>
+              <w:rPr>
+                <w:rFonts w:ascii="Source Sans Pro" w:hAnsi="Source Sans Pro"/>
+              </w:rPr>
               <w:t>2021</w:t>
             </w:r>
           </w:p>
@@ -2530,6 +2532,123 @@
               <w:rPr>
                 <w:rFonts w:ascii="Source Sans Pro" w:hAnsi="Source Sans Pro"/>
               </w:rPr>
+              <w:t>2019 – present</w:t>
+            </w:r>
+          </w:p>
+        </w:tc>
+        <w:tc>
+          <w:tcPr>
+            <w:tcW w:w="7343" w:type="dxa"/>
+          </w:tcPr>
+          <w:p>
+            <w:pPr>
+              <w:rPr>
+                <w:rFonts w:ascii="Source Sans Pro" w:hAnsi="Source Sans Pro"/>
+              </w:rPr>
+            </w:pPr>
+            <w:r>
+              <w:rPr>
+                <w:rFonts w:ascii="Source Sans Pro" w:hAnsi="Source Sans Pro"/>
+              </w:rPr>
+              <w:t>Volunteer Activities Support Worker</w:t>
+            </w:r>
+          </w:p>
+          <w:p>
+            <w:pPr>
+              <w:rPr>
+                <w:rFonts w:ascii="Source Sans Pro" w:hAnsi="Source Sans Pro"/>
+              </w:rPr>
+            </w:pPr>
+            <w:proofErr w:type="spellStart"/>
+            <w:r>
+              <w:rPr>
+                <w:rFonts w:ascii="Source Sans Pro" w:hAnsi="Source Sans Pro"/>
+              </w:rPr>
+              <w:t>Creatovators</w:t>
+            </w:r>
+            <w:proofErr w:type="spellEnd"/>
+            <w:r>
+              <w:rPr>
+                <w:rFonts w:ascii="Source Sans Pro" w:hAnsi="Source Sans Pro"/>
+              </w:rPr>
+              <w:t xml:space="preserve"> CIC</w:t>
+            </w:r>
+          </w:p>
+        </w:tc>
+      </w:tr>
+      <w:tr>
+        <w:tc>
+          <w:tcPr>
+            <w:tcW w:w="1588" w:type="dxa"/>
+          </w:tcPr>
+          <w:p>
+            <w:pPr>
+              <w:rPr>
+                <w:rFonts w:ascii="Source Sans Pro" w:hAnsi="Source Sans Pro"/>
+              </w:rPr>
+            </w:pPr>
+          </w:p>
+        </w:tc>
+        <w:tc>
+          <w:tcPr>
+            <w:tcW w:w="7343" w:type="dxa"/>
+          </w:tcPr>
+          <w:p>
+            <w:pPr>
+              <w:rPr>
+                <w:rFonts w:ascii="Source Sans Pro" w:hAnsi="Source Sans Pro"/>
+              </w:rPr>
+            </w:pPr>
+            <w:r>
+              <w:rPr>
+                <w:rFonts w:ascii="Source Sans Pro" w:hAnsi="Source Sans Pro"/>
+              </w:rPr>
+              <w:t>Assist the running of a support group for autistic children and their families. Conduct Lego-Therapy sessions promoting pro-social behaviour.</w:t>
+            </w:r>
+          </w:p>
+        </w:tc>
+      </w:tr>
+      <w:tr>
+        <w:tc>
+          <w:tcPr>
+            <w:tcW w:w="1588" w:type="dxa"/>
+          </w:tcPr>
+          <w:p>
+            <w:pPr>
+              <w:rPr>
+                <w:rFonts w:ascii="Source Sans Pro" w:hAnsi="Source Sans Pro"/>
+              </w:rPr>
+            </w:pPr>
+          </w:p>
+        </w:tc>
+        <w:tc>
+          <w:tcPr>
+            <w:tcW w:w="7343" w:type="dxa"/>
+          </w:tcPr>
+          <w:p>
+            <w:pPr>
+              <w:rPr>
+                <w:rFonts w:ascii="Source Sans Pro" w:hAnsi="Source Sans Pro"/>
+              </w:rPr>
+            </w:pPr>
+          </w:p>
+        </w:tc>
+      </w:tr>
+      <w:tr>
+        <w:tc>
+          <w:tcPr>
+            <w:tcW w:w="1588" w:type="dxa"/>
+          </w:tcPr>
+          <w:p>
+            <w:pPr>
+              <w:rPr>
+                <w:rFonts w:ascii="Source Sans Pro" w:hAnsi="Source Sans Pro"/>
+              </w:rPr>
+            </w:pPr>
+            <w:r>
+              <w:rPr>
+                <w:rFonts w:ascii="Source Sans Pro" w:hAnsi="Source Sans Pro"/>
+              </w:rPr>
               <w:t xml:space="preserve">2020 </w:t>
             </w:r>
             <w:r>
@@ -2588,129 +2707,6 @@
               </w:rPr>
               <w:br/>
             </w:r>
-          </w:p>
-        </w:tc>
-      </w:tr>
-      <w:tr>
-        <w:tc>
-          <w:tcPr>
-            <w:tcW w:w="1588" w:type="dxa"/>
-          </w:tcPr>
-          <w:p>
-            <w:pPr>
-              <w:rPr>
-                <w:rFonts w:ascii="Source Sans Pro" w:hAnsi="Source Sans Pro"/>
-              </w:rPr>
-            </w:pPr>
-            <w:r>
-              <w:rPr>
-                <w:rFonts w:ascii="Source Sans Pro" w:hAnsi="Source Sans Pro"/>
-              </w:rPr>
-              <w:t xml:space="preserve">2019 </w:t>
-            </w:r>
-            <w:r>
-              <w:rPr>
-                <w:rFonts w:ascii="Source Sans Pro" w:hAnsi="Source Sans Pro"/>
-              </w:rPr>
-              <w:t>– present</w:t>
-            </w:r>
-          </w:p>
-        </w:tc>
-        <w:tc>
-          <w:tcPr>
-            <w:tcW w:w="7343" w:type="dxa"/>
-          </w:tcPr>
-          <w:p>
-            <w:pPr>
-              <w:rPr>
-                <w:rFonts w:ascii="Source Sans Pro" w:hAnsi="Source Sans Pro"/>
-              </w:rPr>
-            </w:pPr>
-            <w:r>
-              <w:rPr>
-                <w:rFonts w:ascii="Source Sans Pro" w:hAnsi="Source Sans Pro"/>
-              </w:rPr>
-              <w:t>Volunteer Activities Support Worker</w:t>
-            </w:r>
-          </w:p>
-          <w:p>
-            <w:pPr>
-              <w:rPr>
-                <w:rFonts w:ascii="Source Sans Pro" w:hAnsi="Source Sans Pro"/>
-              </w:rPr>
-            </w:pPr>
-            <w:proofErr w:type="spellStart"/>
-            <w:r>
-              <w:rPr>
-                <w:rFonts w:ascii="Source Sans Pro" w:hAnsi="Source Sans Pro"/>
-              </w:rPr>
-              <w:t>Creatovators</w:t>
-            </w:r>
-            <w:proofErr w:type="spellEnd"/>
-            <w:r>
-              <w:rPr>
-                <w:rFonts w:ascii="Source Sans Pro" w:hAnsi="Source Sans Pro"/>
-              </w:rPr>
-              <w:t xml:space="preserve"> CIC</w:t>
-            </w:r>
-          </w:p>
-        </w:tc>
-      </w:tr>
-      <w:tr>
-        <w:tc>
-          <w:tcPr>
-            <w:tcW w:w="1588" w:type="dxa"/>
-          </w:tcPr>
-          <w:p>
-            <w:pPr>
-              <w:rPr>
-                <w:rFonts w:ascii="Source Sans Pro" w:hAnsi="Source Sans Pro"/>
-              </w:rPr>
-            </w:pPr>
-          </w:p>
-        </w:tc>
-        <w:tc>
-          <w:tcPr>
-            <w:tcW w:w="7343" w:type="dxa"/>
-          </w:tcPr>
-          <w:p>
-            <w:pPr>
-              <w:rPr>
-                <w:rFonts w:ascii="Source Sans Pro" w:hAnsi="Source Sans Pro"/>
-              </w:rPr>
-            </w:pPr>
-            <w:r>
-              <w:rPr>
-                <w:rFonts w:ascii="Source Sans Pro" w:hAnsi="Source Sans Pro"/>
-              </w:rPr>
-              <w:t>Assist the running of a support group for autistic children and their families. Conduct Lego-Therapy sessions promoting pro-social behaviour.</w:t>
-            </w:r>
-          </w:p>
-        </w:tc>
-      </w:tr>
-      <w:tr>
-        <w:tc>
-          <w:tcPr>
-            <w:tcW w:w="1588" w:type="dxa"/>
-          </w:tcPr>
-          <w:p>
-            <w:pPr>
-              <w:rPr>
-                <w:rFonts w:ascii="Source Sans Pro" w:hAnsi="Source Sans Pro"/>
-              </w:rPr>
-            </w:pPr>
-          </w:p>
-        </w:tc>
-        <w:tc>
-          <w:tcPr>
-            <w:tcW w:w="7343" w:type="dxa"/>
-          </w:tcPr>
-          <w:p>
-            <w:pPr>
-              <w:rPr>
-                <w:rFonts w:ascii="Source Sans Pro" w:hAnsi="Source Sans Pro"/>
-              </w:rPr>
-            </w:pPr>
           </w:p>
         </w:tc>
       </w:tr>
@@ -3589,13 +3585,19 @@
               <w:tab/>
             </w:r>
             <w:r>
-              <w:t>06</w:t>
+              <w:t>0</w:t>
+            </w:r>
+            <w:r>
+              <w:t>8</w:t>
             </w:r>
             <w:r>
               <w:t>/</w:t>
             </w:r>
             <w:r>
-              <w:t>05</w:t>
+              <w:t>0</w:t>
+            </w:r>
+            <w:r>
+              <w:t>6</w:t>
             </w:r>
             <w:r>
               <w:t>/20</w:t>
@@ -4829,12 +4831,19 @@
 </file>
 
 <file path=customXml/item1.xml><?xml version="1.0" encoding="utf-8"?>
-<p:properties xmlns:p="http://schemas.microsoft.com/office/2006/metadata/properties" xmlns:xsi="http://www.w3.org/2001/XMLSchema-instance" xmlns:pc="http://schemas.microsoft.com/office/infopath/2007/PartnerControls">
-  <documentManagement/>
-</p:properties>
+<?mso-contentType ?>
+<FormTemplates xmlns="http://schemas.microsoft.com/sharepoint/v3/contenttype/forms">
+  <Display>DocumentLibraryForm</Display>
+  <Edit>DocumentLibraryForm</Edit>
+  <New>DocumentLibraryForm</New>
+</FormTemplates>
 </file>
 
 <file path=customXml/item2.xml><?xml version="1.0" encoding="utf-8"?>
+<b:Sources xmlns:b="http://schemas.openxmlformats.org/officeDocument/2006/bibliography" xmlns="http://schemas.openxmlformats.org/officeDocument/2006/bibliography" SelectedStyle="\APASixthEditionOfficeOnline.xsl" StyleName="APA" Version="6"/>
+</file>
+
+<file path=customXml/item3.xml><?xml version="1.0" encoding="utf-8"?>
 <ct:contentTypeSchema xmlns:ct="http://schemas.microsoft.com/office/2006/metadata/contentType" xmlns:ma="http://schemas.microsoft.com/office/2006/metadata/properties/metaAttributes" ct:_="" ma:_="" ma:contentTypeName="Document" ma:contentTypeID="0x0101004E0AC046D158EE4DB937DA9A56D27D1C" ma:contentTypeVersion="10" ma:contentTypeDescription="Create a new document." ma:contentTypeScope="" ma:versionID="f1b105e6b9cff91feb409560dbf6f7aa">
   <xsd:schema xmlns:xsd="http://www.w3.org/2001/XMLSchema" xmlns:xs="http://www.w3.org/2001/XMLSchema" xmlns:p="http://schemas.microsoft.com/office/2006/metadata/properties" xmlns:ns3="b24ac480-a0b1-4388-a6cd-cfb001cdf6c7" xmlns:ns4="e7d8f92c-3952-4b7d-acc4-88cf8f2f7888" targetNamespace="http://schemas.microsoft.com/office/2006/metadata/properties" ma:root="true" ma:fieldsID="8ce9a1263d385fff90f75fc0f277280b" ns3:_="" ns4:_="">
     <xsd:import namespace="b24ac480-a0b1-4388-a6cd-cfb001cdf6c7"/>
@@ -5037,29 +5046,29 @@
 </ct:contentTypeSchema>
 </file>
 
-<file path=customXml/item3.xml><?xml version="1.0" encoding="utf-8"?>
-<b:Sources xmlns:b="http://schemas.openxmlformats.org/officeDocument/2006/bibliography" xmlns="http://schemas.openxmlformats.org/officeDocument/2006/bibliography" SelectedStyle="\APASixthEditionOfficeOnline.xsl" StyleName="APA" Version="6"/>
-</file>
-
 <file path=customXml/item4.xml><?xml version="1.0" encoding="utf-8"?>
-<?mso-contentType ?>
-<FormTemplates xmlns="http://schemas.microsoft.com/sharepoint/v3/contenttype/forms">
-  <Display>DocumentLibraryForm</Display>
-  <Edit>DocumentLibraryForm</Edit>
-  <New>DocumentLibraryForm</New>
-</FormTemplates>
+<p:properties xmlns:p="http://schemas.microsoft.com/office/2006/metadata/properties" xmlns:xsi="http://www.w3.org/2001/XMLSchema-instance" xmlns:pc="http://schemas.microsoft.com/office/infopath/2007/PartnerControls">
+  <documentManagement/>
+</p:properties>
 </file>
 
 <file path=customXml/itemProps1.xml><?xml version="1.0" encoding="utf-8"?>
-<ds:datastoreItem xmlns:ds="http://schemas.openxmlformats.org/officeDocument/2006/customXml" ds:itemID="{DD97F3C8-62EE-4BC5-A92B-F4DA5CE92DF8}">
+<ds:datastoreItem xmlns:ds="http://schemas.openxmlformats.org/officeDocument/2006/customXml" ds:itemID="{4C53A478-4862-4699-9810-166E8FEE5B0D}">
   <ds:schemaRefs>
-    <ds:schemaRef ds:uri="http://schemas.microsoft.com/office/2006/metadata/properties"/>
-    <ds:schemaRef ds:uri="http://schemas.microsoft.com/office/infopath/2007/PartnerControls"/>
+    <ds:schemaRef ds:uri="http://schemas.microsoft.com/sharepoint/v3/contenttype/forms"/>
   </ds:schemaRefs>
 </ds:datastoreItem>
 </file>
 
 <file path=customXml/itemProps2.xml><?xml version="1.0" encoding="utf-8"?>
+<ds:datastoreItem xmlns:ds="http://schemas.openxmlformats.org/officeDocument/2006/customXml" ds:itemID="{A9BA2174-033C-45ED-94FB-74A1FBFA3035}">
+  <ds:schemaRefs>
+    <ds:schemaRef ds:uri="http://schemas.openxmlformats.org/officeDocument/2006/bibliography"/>
+  </ds:schemaRefs>
+</ds:datastoreItem>
+</file>
+
+<file path=customXml/itemProps3.xml><?xml version="1.0" encoding="utf-8"?>
 <ds:datastoreItem xmlns:ds="http://schemas.openxmlformats.org/officeDocument/2006/customXml" ds:itemID="{11E413AD-A691-4C16-BEE5-5C367C5D236C}">
   <ds:schemaRefs>
     <ds:schemaRef ds:uri="http://schemas.microsoft.com/office/2006/metadata/contentType"/>
@@ -5078,18 +5087,11 @@
 </ds:datastoreItem>
 </file>
 
-<file path=customXml/itemProps3.xml><?xml version="1.0" encoding="utf-8"?>
-<ds:datastoreItem xmlns:ds="http://schemas.openxmlformats.org/officeDocument/2006/customXml" ds:itemID="{A9BA2174-033C-45ED-94FB-74A1FBFA3035}">
+<file path=customXml/itemProps4.xml><?xml version="1.0" encoding="utf-8"?>
+<ds:datastoreItem xmlns:ds="http://schemas.openxmlformats.org/officeDocument/2006/customXml" ds:itemID="{DD97F3C8-62EE-4BC5-A92B-F4DA5CE92DF8}">
   <ds:schemaRefs>
-    <ds:schemaRef ds:uri="http://schemas.openxmlformats.org/officeDocument/2006/bibliography"/>
-  </ds:schemaRefs>
-</ds:datastoreItem>
-</file>
-
-<file path=customXml/itemProps4.xml><?xml version="1.0" encoding="utf-8"?>
-<ds:datastoreItem xmlns:ds="http://schemas.openxmlformats.org/officeDocument/2006/customXml" ds:itemID="{4C53A478-4862-4699-9810-166E8FEE5B0D}">
-  <ds:schemaRefs>
-    <ds:schemaRef ds:uri="http://schemas.microsoft.com/sharepoint/v3/contenttype/forms"/>
+    <ds:schemaRef ds:uri="http://schemas.microsoft.com/office/2006/metadata/properties"/>
+    <ds:schemaRef ds:uri="http://schemas.microsoft.com/office/infopath/2007/PartnerControls"/>
   </ds:schemaRefs>
 </ds:datastoreItem>
 </file>
</xml_diff>

<commit_message>
rebuilding site Thu Jul 21 11:36:52 GMTST 2022
</commit_message>
<xml_diff>
--- a/files/cv.docx
+++ b/files/cv.docx
@@ -489,7 +489,21 @@
               <w:rPr>
                 <w:rFonts w:ascii="Source Sans Pro" w:hAnsi="Source Sans Pro"/>
               </w:rPr>
-              <w:t>MA (SocSci) in Psychology (1</w:t>
+              <w:t>MA (</w:t>
+            </w:r>
+            <w:proofErr w:type="spellStart"/>
+            <w:r>
+              <w:rPr>
+                <w:rFonts w:ascii="Source Sans Pro" w:hAnsi="Source Sans Pro"/>
+              </w:rPr>
+              <w:t>SocSci</w:t>
+            </w:r>
+            <w:proofErr w:type="spellEnd"/>
+            <w:r>
+              <w:rPr>
+                <w:rFonts w:ascii="Source Sans Pro" w:hAnsi="Source Sans Pro"/>
+              </w:rPr>
+              <w:t>) in Psychology (1</w:t>
             </w:r>
             <w:r>
               <w:rPr>
@@ -765,7 +779,21 @@
               <w:rPr>
                 <w:rFonts w:ascii="Source Sans Pro" w:hAnsi="Source Sans Pro"/>
               </w:rPr>
-              <w:t>A part-time role supporting Edify’s research and development goals. Projects include exploring different methods of gaze detection for estimating engagement in Virtual Reality and investigating how differing levels of detail of virtual avatars impact emotion recognition.</w:t>
+              <w:t xml:space="preserve">A part-time role supporting </w:t>
+            </w:r>
+            <w:proofErr w:type="spellStart"/>
+            <w:r>
+              <w:rPr>
+                <w:rFonts w:ascii="Source Sans Pro" w:hAnsi="Source Sans Pro"/>
+              </w:rPr>
+              <w:t>Edify’s</w:t>
+            </w:r>
+            <w:proofErr w:type="spellEnd"/>
+            <w:r>
+              <w:rPr>
+                <w:rFonts w:ascii="Source Sans Pro" w:hAnsi="Source Sans Pro"/>
+              </w:rPr>
+              <w:t xml:space="preserve"> research and development goals. Projects include exploring different methods of gaze detection for estimating engagement in Virtual Reality and investigating how differing levels of detail of virtual avatars impact emotion recognition.</w:t>
             </w:r>
           </w:p>
         </w:tc>
@@ -905,7 +933,21 @@
               <w:rPr>
                 <w:rFonts w:ascii="Source Sans Pro" w:hAnsi="Source Sans Pro"/>
               </w:rPr>
-              <w:t xml:space="preserve">Supervised by Dr Joanna Wincenciak. </w:t>
+              <w:t xml:space="preserve">Supervised by Dr Joanna </w:t>
+            </w:r>
+            <w:proofErr w:type="spellStart"/>
+            <w:r>
+              <w:rPr>
+                <w:rFonts w:ascii="Source Sans Pro" w:hAnsi="Source Sans Pro"/>
+              </w:rPr>
+              <w:t>Wincenciak</w:t>
+            </w:r>
+            <w:proofErr w:type="spellEnd"/>
+            <w:r>
+              <w:rPr>
+                <w:rFonts w:ascii="Source Sans Pro" w:hAnsi="Source Sans Pro"/>
+              </w:rPr>
+              <w:t xml:space="preserve">. </w:t>
             </w:r>
             <w:r>
               <w:rPr>
@@ -1207,8 +1249,22 @@
           <w:szCs w:val="22"/>
           <w:lang w:eastAsia="en-GB"/>
         </w:rPr>
-        <w:t>J Autism Dev Disord</w:t>
-      </w:r>
+        <w:t xml:space="preserve">J Autism Dev </w:t>
+      </w:r>
+      <w:proofErr w:type="spellStart"/>
+      <w:r>
+        <w:rPr>
+          <w:rFonts w:ascii="Source Sans Pro" w:eastAsia="Times New Roman" w:hAnsi="Source Sans Pro" w:cstheme="minorHAnsi"/>
+          <w:b w:val="0"/>
+          <w:i/>
+          <w:iCs/>
+          <w:sz w:val="22"/>
+          <w:szCs w:val="22"/>
+          <w:lang w:eastAsia="en-GB"/>
+        </w:rPr>
+        <w:t>Disord</w:t>
+      </w:r>
+      <w:proofErr w:type="spellEnd"/>
       <w:r>
         <w:rPr>
           <w:rFonts w:ascii="Source Sans Pro" w:eastAsia="Times New Roman" w:hAnsi="Source Sans Pro" w:cstheme="minorHAnsi"/>
@@ -1403,7 +1459,23 @@
           <w:rFonts w:ascii="Source Sans Pro" w:hAnsi="Source Sans Pro"/>
           <w:lang w:eastAsia="en-GB"/>
         </w:rPr>
-        <w:t>, Latkovskis, I., Failes, J., Kirkwood, N., &amp; McDonnell, N. (2022, January 11). Virtual Reality (VR) Multi-User Lab for Immersive Teaching.</w:t>
+        <w:t xml:space="preserve">, </w:t>
+      </w:r>
+      <w:proofErr w:type="spellStart"/>
+      <w:r>
+        <w:rPr>
+          <w:rFonts w:ascii="Source Sans Pro" w:hAnsi="Source Sans Pro"/>
+          <w:lang w:eastAsia="en-GB"/>
+        </w:rPr>
+        <w:t>Latkovskis</w:t>
+      </w:r>
+      <w:proofErr w:type="spellEnd"/>
+      <w:r>
+        <w:rPr>
+          <w:rFonts w:ascii="Source Sans Pro" w:hAnsi="Source Sans Pro"/>
+          <w:lang w:eastAsia="en-GB"/>
+        </w:rPr>
+        <w:t>, I., Failes, J., Kirkwood, N., &amp; McDonnell, N. (2022, January 11). Virtual Reality (VR) Multi-User Lab for Immersive Teaching.</w:t>
       </w:r>
       <w:r>
         <w:rPr>
@@ -2610,11 +2682,19 @@
                 <w:rFonts w:ascii="Source Sans Pro" w:hAnsi="Source Sans Pro"/>
               </w:rPr>
             </w:pPr>
-            <w:r>
-              <w:rPr>
-                <w:rFonts w:ascii="Source Sans Pro" w:hAnsi="Source Sans Pro"/>
-              </w:rPr>
-              <w:t>Creatovators CIC</w:t>
+            <w:proofErr w:type="spellStart"/>
+            <w:r>
+              <w:rPr>
+                <w:rFonts w:ascii="Source Sans Pro" w:hAnsi="Source Sans Pro"/>
+              </w:rPr>
+              <w:t>Creatovators</w:t>
+            </w:r>
+            <w:proofErr w:type="spellEnd"/>
+            <w:r>
+              <w:rPr>
+                <w:rFonts w:ascii="Source Sans Pro" w:hAnsi="Source Sans Pro"/>
+              </w:rPr>
+              <w:t xml:space="preserve"> CIC</w:t>
             </w:r>
           </w:p>
         </w:tc>
@@ -3143,17 +3223,6 @@
         </w:tc>
       </w:tr>
     </w:tbl>
-    <w:p>
-      <w:pPr>
-        <w:pStyle w:val="Heading1"/>
-        <w:spacing w:line="240" w:lineRule="auto"/>
-        <w:rPr>
-          <w:rFonts w:ascii="Source Sans Pro" w:hAnsi="Source Sans Pro"/>
-          <w:sz w:val="22"/>
-          <w:szCs w:val="22"/>
-        </w:rPr>
-      </w:pPr>
-    </w:p>
     <w:p>
       <w:pPr>
         <w:rPr>

</xml_diff>

<commit_message>
rebuilding site Tue Sep 20 16:47:29 GMTST 2022
</commit_message>
<xml_diff>
--- a/files/cv.docx
+++ b/files/cv.docx
@@ -50,19 +50,8 @@
     <w:p>
       <w:pPr>
         <w:pStyle w:val="Heading1"/>
-        <w:spacing w:line="240" w:lineRule="auto"/>
-        <w:rPr>
-          <w:rFonts w:ascii="Source Sans Pro" w:hAnsi="Source Sans Pro"/>
-          <w:sz w:val="22"/>
-          <w:szCs w:val="22"/>
-        </w:rPr>
-      </w:pPr>
-      <w:r>
-        <w:rPr>
-          <w:rFonts w:ascii="Source Sans Pro" w:hAnsi="Source Sans Pro"/>
-          <w:sz w:val="22"/>
-          <w:szCs w:val="22"/>
-        </w:rPr>
+      </w:pPr>
+      <w:r>
         <w:t>Education</w:t>
       </w:r>
     </w:p>
@@ -601,35 +590,14 @@
     <w:p>
       <w:pPr>
         <w:pStyle w:val="Heading1"/>
-        <w:spacing w:line="240" w:lineRule="auto"/>
-        <w:rPr>
-          <w:rFonts w:ascii="Source Sans Pro" w:hAnsi="Source Sans Pro"/>
-          <w:sz w:val="22"/>
-          <w:szCs w:val="22"/>
-        </w:rPr>
-      </w:pPr>
-      <w:r>
-        <w:rPr>
-          <w:rFonts w:ascii="Source Sans Pro" w:hAnsi="Source Sans Pro"/>
-          <w:sz w:val="22"/>
-          <w:szCs w:val="22"/>
-        </w:rPr>
+      </w:pPr>
+      <w:r>
         <w:t>Researc</w:t>
       </w:r>
       <w:r>
-        <w:rPr>
-          <w:rFonts w:ascii="Source Sans Pro" w:hAnsi="Source Sans Pro"/>
-          <w:sz w:val="22"/>
-          <w:szCs w:val="22"/>
-        </w:rPr>
         <w:t xml:space="preserve">h </w:t>
       </w:r>
       <w:r>
-        <w:rPr>
-          <w:rFonts w:ascii="Source Sans Pro" w:hAnsi="Source Sans Pro"/>
-          <w:sz w:val="22"/>
-          <w:szCs w:val="22"/>
-        </w:rPr>
         <w:t>Experience</w:t>
       </w:r>
     </w:p>
@@ -1162,142 +1130,124 @@
     <w:p>
       <w:pPr>
         <w:pStyle w:val="Heading1"/>
-        <w:spacing w:before="100" w:beforeAutospacing="1" w:line="240" w:lineRule="auto"/>
-        <w:rPr>
-          <w:rFonts w:ascii="Source Sans Pro" w:hAnsi="Source Sans Pro"/>
-          <w:sz w:val="22"/>
-          <w:szCs w:val="22"/>
-        </w:rPr>
-      </w:pPr>
-      <w:r>
-        <w:rPr>
-          <w:rFonts w:ascii="Source Sans Pro" w:hAnsi="Source Sans Pro"/>
-          <w:sz w:val="22"/>
-          <w:szCs w:val="22"/>
-        </w:rPr>
+      </w:pPr>
+    </w:p>
+    <w:p>
+      <w:pPr>
+        <w:rPr>
+          <w:rFonts w:ascii="Source Sans Pro" w:eastAsiaTheme="majorEastAsia" w:hAnsi="Source Sans Pro" w:cstheme="majorBidi"/>
+          <w:b/>
+        </w:rPr>
+      </w:pPr>
+      <w:r>
+        <w:rPr>
+          <w:rFonts w:ascii="Source Sans Pro" w:hAnsi="Source Sans Pro"/>
+        </w:rPr>
+        <w:br w:type="page"/>
+      </w:r>
+    </w:p>
+    <w:p>
+      <w:pPr>
+        <w:pStyle w:val="Heading1"/>
+      </w:pPr>
+      <w:r>
         <w:lastRenderedPageBreak/>
         <w:t>Publications</w:t>
       </w:r>
     </w:p>
     <w:p>
       <w:pPr>
-        <w:pStyle w:val="Heading1"/>
-        <w:spacing w:before="100" w:beforeAutospacing="1" w:after="100" w:afterAutospacing="1" w:line="240" w:lineRule="auto"/>
+        <w:spacing w:after="100" w:afterAutospacing="1" w:line="240" w:lineRule="auto"/>
         <w:ind w:left="720" w:hanging="720"/>
         <w:rPr>
-          <w:rFonts w:ascii="Source Sans Pro" w:eastAsia="Times New Roman" w:hAnsi="Source Sans Pro" w:cstheme="minorHAnsi"/>
-          <w:b w:val="0"/>
-          <w:sz w:val="22"/>
-          <w:szCs w:val="22"/>
+          <w:rFonts w:ascii="Source Sans Pro" w:hAnsi="Source Sans Pro"/>
           <w:lang w:eastAsia="en-GB"/>
         </w:rPr>
       </w:pPr>
       <w:r>
         <w:rPr>
-          <w:rFonts w:ascii="Source Sans Pro" w:eastAsia="Times New Roman" w:hAnsi="Source Sans Pro" w:cstheme="minorHAnsi"/>
+          <w:rFonts w:ascii="Source Sans Pro" w:hAnsi="Source Sans Pro"/>
+          <w:b/>
           <w:bCs/>
-          <w:sz w:val="22"/>
-          <w:szCs w:val="22"/>
           <w:lang w:eastAsia="en-GB"/>
         </w:rPr>
         <w:t>Millington, E.</w:t>
       </w:r>
       <w:r>
         <w:rPr>
-          <w:rFonts w:ascii="Source Sans Pro" w:eastAsia="Times New Roman" w:hAnsi="Source Sans Pro" w:cstheme="minorHAnsi"/>
-          <w:b w:val="0"/>
-          <w:sz w:val="22"/>
-          <w:szCs w:val="22"/>
+          <w:rFonts w:ascii="Source Sans Pro" w:hAnsi="Source Sans Pro"/>
           <w:lang w:eastAsia="en-GB"/>
         </w:rPr>
-        <w:t>, Simmons, D.R. &amp; Cleland Woods, H. (202</w:t>
-      </w:r>
-      <w:r>
-        <w:rPr>
-          <w:rFonts w:ascii="Source Sans Pro" w:eastAsia="Times New Roman" w:hAnsi="Source Sans Pro" w:cstheme="minorHAnsi"/>
-          <w:b w:val="0"/>
-          <w:sz w:val="22"/>
-          <w:szCs w:val="22"/>
+        <w:t xml:space="preserve">, </w:t>
+      </w:r>
+      <w:r>
+        <w:rPr>
+          <w:rFonts w:ascii="Source Sans Pro" w:hAnsi="Source Sans Pro"/>
           <w:lang w:eastAsia="en-GB"/>
         </w:rPr>
-        <w:t>2</w:t>
-      </w:r>
-      <w:r>
-        <w:rPr>
-          <w:rFonts w:ascii="Source Sans Pro" w:eastAsia="Times New Roman" w:hAnsi="Source Sans Pro" w:cstheme="minorHAnsi"/>
-          <w:b w:val="0"/>
-          <w:sz w:val="22"/>
-          <w:szCs w:val="22"/>
+        <w:t>Hayashibara</w:t>
+      </w:r>
+      <w:r>
+        <w:rPr>
+          <w:rFonts w:ascii="Source Sans Pro" w:hAnsi="Source Sans Pro"/>
           <w:lang w:eastAsia="en-GB"/>
         </w:rPr>
-        <w:t>). Brief Report: Investigating the Motivations and Autistic Traits of Video Gamers.</w:t>
-      </w:r>
-      <w:r>
-        <w:rPr>
-          <w:sz w:val="22"/>
-          <w:szCs w:val="22"/>
-        </w:rPr>
-        <w:t xml:space="preserve"> </w:t>
-      </w:r>
-      <w:r>
-        <w:rPr>
-          <w:rFonts w:ascii="Source Sans Pro" w:eastAsia="Times New Roman" w:hAnsi="Source Sans Pro" w:cstheme="minorHAnsi"/>
-          <w:b w:val="0"/>
+        <w:t xml:space="preserve">, E., Arthur, T., Husselman, T., Savickaite, S., Taylor, R. (2022). </w:t>
+      </w:r>
+      <w:r>
+        <w:rPr>
+          <w:rFonts w:ascii="Source Sans Pro" w:hAnsi="Source Sans Pro"/>
+          <w:lang w:eastAsia="en-GB"/>
+        </w:rPr>
+        <w:t>Neurodivergent Participatory Action Research in Virtual Reality (VR)</w:t>
+      </w:r>
+      <w:r>
+        <w:rPr>
+          <w:rFonts w:ascii="Source Sans Pro" w:hAnsi="Source Sans Pro"/>
+          <w:lang w:eastAsia="en-GB"/>
+        </w:rPr>
+        <w:t xml:space="preserve">. </w:t>
+      </w:r>
+      <w:r>
+        <w:rPr>
+          <w:rFonts w:ascii="Source Sans Pro" w:hAnsi="Source Sans Pro"/>
           <w:i/>
           <w:iCs/>
-          <w:sz w:val="22"/>
-          <w:szCs w:val="22"/>
           <w:lang w:eastAsia="en-GB"/>
         </w:rPr>
-        <w:t xml:space="preserve">J Autism Dev </w:t>
-      </w:r>
-      <w:proofErr w:type="spellStart"/>
-      <w:r>
-        <w:rPr>
-          <w:rFonts w:ascii="Source Sans Pro" w:eastAsia="Times New Roman" w:hAnsi="Source Sans Pro" w:cstheme="minorHAnsi"/>
-          <w:b w:val="0"/>
-          <w:i/>
-          <w:iCs/>
-          <w:sz w:val="22"/>
-          <w:szCs w:val="22"/>
+        <w:t>Journal of Enabling Technologies</w:t>
+      </w:r>
+      <w:r>
+        <w:rPr>
+          <w:rFonts w:ascii="Source Sans Pro" w:hAnsi="Source Sans Pro"/>
           <w:lang w:eastAsia="en-GB"/>
         </w:rPr>
-        <w:t>Disord</w:t>
-      </w:r>
-      <w:proofErr w:type="spellEnd"/>
-      <w:r>
-        <w:rPr>
-          <w:rFonts w:ascii="Source Sans Pro" w:eastAsia="Times New Roman" w:hAnsi="Source Sans Pro" w:cstheme="minorHAnsi"/>
-          <w:b w:val="0"/>
-          <w:sz w:val="22"/>
-          <w:szCs w:val="22"/>
+        <w:t xml:space="preserve">. </w:t>
+      </w:r>
+      <w:r>
+        <w:rPr>
+          <w:rFonts w:ascii="Source Sans Pro" w:hAnsi="Source Sans Pro"/>
           <w:lang w:eastAsia="en-GB"/>
         </w:rPr>
-        <w:t xml:space="preserve"> 52, pp 1403–1407 </w:t>
-      </w:r>
-      <w:r>
-        <w:rPr>
-          <w:rFonts w:ascii="Source Sans Pro" w:eastAsia="Times New Roman" w:hAnsi="Source Sans Pro" w:cstheme="minorHAnsi"/>
-          <w:b w:val="0"/>
-          <w:sz w:val="22"/>
-          <w:szCs w:val="22"/>
-          <w:lang w:eastAsia="en-GB"/>
-        </w:rPr>
-        <w:t xml:space="preserve"> </w:t>
+        <w:t xml:space="preserve">Vol. ahead-of-print No. ahead-of-print. </w:t>
       </w:r>
       <w:hyperlink r:id="rId11" w:history="1">
         <w:r>
           <w:rPr>
             <w:rStyle w:val="Hyperlink"/>
-            <w:rFonts w:ascii="Source Sans Pro" w:eastAsia="Times New Roman" w:hAnsi="Source Sans Pro" w:cstheme="minorHAnsi"/>
-            <w:b w:val="0"/>
-            <w:sz w:val="22"/>
-            <w:szCs w:val="22"/>
+            <w:rFonts w:ascii="Source Sans Pro" w:hAnsi="Source Sans Pro"/>
             <w:lang w:eastAsia="en-GB"/>
           </w:rPr>
-          <w:t>https://doi.org/10.1007/s10803-021-04994-x</w:t>
+          <w:t>https://doi.org/10.1108/JET-05-2022-0037</w:t>
         </w:r>
       </w:hyperlink>
+      <w:r>
+        <w:rPr>
+          <w:rFonts w:ascii="Source Sans Pro" w:hAnsi="Source Sans Pro"/>
+          <w:lang w:eastAsia="en-GB"/>
+        </w:rPr>
+        <w:t xml:space="preserve"> </w:t>
+      </w:r>
     </w:p>
     <w:p>
       <w:pPr>
@@ -1313,7 +1263,14 @@
           <w:rFonts w:ascii="Source Sans Pro" w:hAnsi="Source Sans Pro"/>
           <w:lang w:eastAsia="en-GB"/>
         </w:rPr>
-        <w:t xml:space="preserve">Savickaite, S., McNaughton, K., Gaillard, E., Amaya, I., McDonnell, N., </w:t>
+        <w:t>Savickaite, S.,</w:t>
+      </w:r>
+      <w:r>
+        <w:rPr>
+          <w:rFonts w:ascii="Source Sans Pro" w:hAnsi="Source Sans Pro"/>
+          <w:lang w:eastAsia="en-GB"/>
+        </w:rPr>
+        <w:t xml:space="preserve"> Arthur, T., </w:t>
       </w:r>
       <w:r>
         <w:rPr>
@@ -1329,14 +1286,35 @@
           <w:rFonts w:ascii="Source Sans Pro" w:hAnsi="Source Sans Pro"/>
           <w:lang w:eastAsia="en-GB"/>
         </w:rPr>
-        <w:t xml:space="preserve">, &amp; Simmons, D. (2021). </w:t>
+        <w:t xml:space="preserve">, Husselman, T., Taylor, R., </w:t>
       </w:r>
       <w:r>
         <w:rPr>
           <w:rFonts w:ascii="Source Sans Pro" w:hAnsi="Source Sans Pro"/>
           <w:lang w:eastAsia="en-GB"/>
         </w:rPr>
-        <w:t xml:space="preserve">Exploratory study on the use of HMD virtual reality to investigate individual differences in visual processing styles. </w:t>
+        <w:t>Hayashibara</w:t>
+      </w:r>
+      <w:r>
+        <w:rPr>
+          <w:rFonts w:ascii="Source Sans Pro" w:hAnsi="Source Sans Pro"/>
+          <w:lang w:eastAsia="en-GB"/>
+        </w:rPr>
+        <w:t xml:space="preserve">, E. (2022). </w:t>
+      </w:r>
+      <w:r>
+        <w:rPr>
+          <w:rFonts w:ascii="Source Sans Pro" w:hAnsi="Source Sans Pro"/>
+          <w:lang w:eastAsia="en-GB"/>
+        </w:rPr>
+        <w:t>Applications of Virtual Reality (VR) in Autism Research: Current trends and taxonomy of definitions</w:t>
+      </w:r>
+      <w:r>
+        <w:rPr>
+          <w:rFonts w:ascii="Source Sans Pro" w:hAnsi="Source Sans Pro"/>
+          <w:lang w:eastAsia="en-GB"/>
+        </w:rPr>
+        <w:t xml:space="preserve">. </w:t>
       </w:r>
       <w:r>
         <w:rPr>
@@ -1352,7 +1330,14 @@
           <w:rFonts w:ascii="Source Sans Pro" w:hAnsi="Source Sans Pro"/>
           <w:lang w:eastAsia="en-GB"/>
         </w:rPr>
-        <w:t xml:space="preserve">, 16, pp. 48-69. </w:t>
+        <w:t xml:space="preserve">. </w:t>
+      </w:r>
+      <w:r>
+        <w:rPr>
+          <w:rFonts w:ascii="Source Sans Pro" w:hAnsi="Source Sans Pro"/>
+          <w:lang w:eastAsia="en-GB"/>
+        </w:rPr>
+        <w:t xml:space="preserve">Vol. ahead-of-print No. ahead-of-print. </w:t>
       </w:r>
       <w:hyperlink r:id="rId12" w:history="1">
         <w:r>
@@ -1361,14 +1346,113 @@
             <w:rFonts w:ascii="Source Sans Pro" w:hAnsi="Source Sans Pro"/>
             <w:lang w:eastAsia="en-GB"/>
           </w:rPr>
+          <w:t>https://doi.org/10.1108/JET-05-2022-0038</w:t>
+        </w:r>
+      </w:hyperlink>
+      <w:r>
+        <w:rPr>
+          <w:rFonts w:ascii="Source Sans Pro" w:hAnsi="Source Sans Pro"/>
+          <w:lang w:eastAsia="en-GB"/>
+        </w:rPr>
+        <w:t xml:space="preserve"> </w:t>
+      </w:r>
+    </w:p>
+    <w:p>
+      <w:pPr>
+        <w:pStyle w:val="Reference"/>
+        <w:rPr>
+          <w:b/>
+        </w:rPr>
+      </w:pPr>
+      <w:r>
+        <w:rPr>
+          <w:b/>
+        </w:rPr>
+        <w:t>Millington, E.</w:t>
+      </w:r>
+      <w:r>
+        <w:t>, Simmons, D.R. &amp; Cleland Woods, H. (202</w:t>
+      </w:r>
+      <w:r>
+        <w:t>2</w:t>
+      </w:r>
+      <w:r>
+        <w:t>). Brief Report: Investigating the Motivations and Autistic Traits of Video Gamers.</w:t>
+      </w:r>
+      <w:r>
+        <w:t xml:space="preserve"> </w:t>
+      </w:r>
+      <w:r>
+        <w:rPr>
+          <w:i/>
+          <w:iCs/>
+        </w:rPr>
+        <w:t xml:space="preserve">J Autism Dev </w:t>
+      </w:r>
+      <w:proofErr w:type="spellStart"/>
+      <w:r>
+        <w:rPr>
+          <w:i/>
+          <w:iCs/>
+        </w:rPr>
+        <w:t>Disord</w:t>
+      </w:r>
+      <w:proofErr w:type="spellEnd"/>
+      <w:r>
+        <w:t xml:space="preserve"> 52, pp 1403–1407 </w:t>
+      </w:r>
+      <w:r>
+        <w:t xml:space="preserve"> </w:t>
+      </w:r>
+      <w:hyperlink r:id="rId13" w:history="1">
+        <w:r>
+          <w:rPr>
+            <w:rStyle w:val="Hyperlink"/>
+            <w:rFonts w:eastAsia="Times New Roman" w:cstheme="minorHAnsi"/>
+          </w:rPr>
+          <w:t>https://doi.org/10.1007/s10803-021-04994-x</w:t>
+        </w:r>
+      </w:hyperlink>
+    </w:p>
+    <w:p>
+      <w:pPr>
+        <w:pStyle w:val="Reference"/>
+      </w:pPr>
+      <w:r>
+        <w:t xml:space="preserve">Savickaite, S., McNaughton, K., Gaillard, E., Amaya, I., McDonnell, N., </w:t>
+      </w:r>
+      <w:r>
+        <w:rPr>
+          <w:b/>
+          <w:bCs/>
+        </w:rPr>
+        <w:t>Millington, E.</w:t>
+      </w:r>
+      <w:r>
+        <w:t xml:space="preserve">, &amp; Simmons, D. (2021). </w:t>
+      </w:r>
+      <w:r>
+        <w:t xml:space="preserve">Exploratory study on the use of HMD virtual reality to investigate individual differences in visual processing styles. </w:t>
+      </w:r>
+      <w:r>
+        <w:rPr>
+          <w:i/>
+          <w:iCs/>
+        </w:rPr>
+        <w:t>Journal of Enabling Technologies</w:t>
+      </w:r>
+      <w:r>
+        <w:t xml:space="preserve">, 16, pp. 48-69. </w:t>
+      </w:r>
+      <w:hyperlink r:id="rId14" w:history="1">
+        <w:r>
+          <w:rPr>
+            <w:rStyle w:val="Hyperlink"/>
+          </w:rPr>
           <w:t>https://doi.org/10.1108/JET-06-2021-0028</w:t>
         </w:r>
       </w:hyperlink>
       <w:r>
-        <w:rPr>
-          <w:rFonts w:ascii="Source Sans Pro" w:hAnsi="Source Sans Pro"/>
-          <w:lang w:eastAsia="en-GB"/>
-        </w:rPr>
         <w:t xml:space="preserve"> </w:t>
       </w:r>
     </w:p>
@@ -1411,7 +1495,7 @@
         </w:rPr>
         <w:t xml:space="preserve">Freeman, C., McMillan, R., McDonnell, N., &amp; Khamis, M. (2022, June 20). ALIVE: Avatar Learning Impact Assessment for Virtual Environments. </w:t>
       </w:r>
-      <w:hyperlink r:id="rId13" w:history="1">
+      <w:hyperlink r:id="rId15" w:history="1">
         <w:r>
           <w:rPr>
             <w:rStyle w:val="Hyperlink"/>
@@ -1484,7 +1568,7 @@
         </w:rPr>
         <w:br/>
       </w:r>
-      <w:hyperlink r:id="rId14" w:history="1">
+      <w:hyperlink r:id="rId16" w:history="1">
         <w:r>
           <w:rPr>
             <w:rStyle w:val="Hyperlink"/>
@@ -1504,270 +1588,47 @@
     </w:p>
     <w:p>
       <w:pPr>
-        <w:pStyle w:val="Heading1"/>
-        <w:spacing w:before="100" w:beforeAutospacing="1" w:after="100" w:afterAutospacing="1" w:line="240" w:lineRule="auto"/>
-        <w:ind w:left="720" w:hanging="720"/>
-        <w:rPr>
-          <w:rFonts w:ascii="Source Sans Pro" w:eastAsia="Times New Roman" w:hAnsi="Source Sans Pro" w:cstheme="minorHAnsi"/>
-          <w:b w:val="0"/>
-          <w:sz w:val="22"/>
-          <w:szCs w:val="22"/>
-          <w:lang w:eastAsia="en-GB"/>
-        </w:rPr>
-      </w:pPr>
-      <w:r>
-        <w:rPr>
-          <w:rFonts w:ascii="Source Sans Pro" w:eastAsia="Times New Roman" w:hAnsi="Source Sans Pro" w:cstheme="minorHAnsi"/>
-          <w:b w:val="0"/>
-          <w:sz w:val="22"/>
-          <w:szCs w:val="22"/>
-          <w:lang w:eastAsia="en-GB"/>
-        </w:rPr>
+        <w:pStyle w:val="Reference"/>
+        <w:rPr>
+          <w:b/>
+        </w:rPr>
+      </w:pPr>
+      <w:r>
         <w:t xml:space="preserve">Brown, L., </w:t>
       </w:r>
       <w:r>
         <w:rPr>
-          <w:rFonts w:ascii="Source Sans Pro" w:eastAsia="Times New Roman" w:hAnsi="Source Sans Pro" w:cstheme="minorHAnsi"/>
-          <w:bCs/>
-          <w:sz w:val="22"/>
-          <w:szCs w:val="22"/>
-          <w:lang w:eastAsia="en-GB"/>
-        </w:rPr>
-        <w:t>Millington, E.</w:t>
-      </w:r>
-      <w:r>
-        <w:rPr>
-          <w:rFonts w:ascii="Source Sans Pro" w:eastAsia="Times New Roman" w:hAnsi="Source Sans Pro" w:cstheme="minorHAnsi"/>
-          <w:b w:val="0"/>
-          <w:sz w:val="22"/>
-          <w:szCs w:val="22"/>
-          <w:lang w:eastAsia="en-GB"/>
-        </w:rPr>
+          <w:b/>
+        </w:rPr>
+        <w:t>Millington, E</w:t>
+      </w:r>
+      <w:r>
+        <w:rPr>
+          <w:b/>
+        </w:rPr>
+        <w:t>.</w:t>
+      </w:r>
+      <w:r>
         <w:t xml:space="preserve">, Robertson, A. E., &amp; Simmons, D. (2021, April 27). Children’s Glasgow Sensory Questionnaire (C-GSQ): Validation of a Simplified and Visually Aided Questionnaire. </w:t>
       </w:r>
-      <w:hyperlink r:id="rId15" w:history="1">
+      <w:hyperlink r:id="rId17" w:history="1">
         <w:r>
           <w:rPr>
             <w:rStyle w:val="Hyperlink"/>
-            <w:rFonts w:ascii="Source Sans Pro" w:eastAsia="Times New Roman" w:hAnsi="Source Sans Pro" w:cstheme="minorHAnsi"/>
-            <w:b w:val="0"/>
-            <w:sz w:val="22"/>
-            <w:szCs w:val="22"/>
-            <w:lang w:eastAsia="en-GB"/>
+            <w:rFonts w:eastAsia="Times New Roman" w:cstheme="minorHAnsi"/>
           </w:rPr>
           <w:t>https://doi.org/10.31234/osf.io/f6bg2</w:t>
         </w:r>
       </w:hyperlink>
       <w:r>
-        <w:rPr>
-          <w:rFonts w:ascii="Source Sans Pro" w:eastAsia="Times New Roman" w:hAnsi="Source Sans Pro" w:cstheme="minorHAnsi"/>
-          <w:b w:val="0"/>
-          <w:sz w:val="22"/>
-          <w:szCs w:val="22"/>
-          <w:lang w:eastAsia="en-GB"/>
-        </w:rPr>
         <w:t xml:space="preserve"> </w:t>
       </w:r>
     </w:p>
     <w:p>
       <w:pPr>
-        <w:spacing w:after="100" w:afterAutospacing="1" w:line="240" w:lineRule="auto"/>
-        <w:ind w:left="720" w:hanging="720"/>
-        <w:rPr>
-          <w:rFonts w:ascii="Source Sans Pro" w:hAnsi="Source Sans Pro"/>
-          <w:lang w:eastAsia="en-GB"/>
-        </w:rPr>
-      </w:pPr>
-      <w:r>
-        <w:rPr>
-          <w:rFonts w:ascii="Source Sans Pro" w:hAnsi="Source Sans Pro"/>
-          <w:b/>
-          <w:bCs/>
-          <w:lang w:eastAsia="en-GB"/>
-        </w:rPr>
-        <w:t>Millington, E.</w:t>
-      </w:r>
-      <w:r>
-        <w:rPr>
-          <w:rFonts w:ascii="Source Sans Pro" w:hAnsi="Source Sans Pro"/>
-          <w:lang w:eastAsia="en-GB"/>
-        </w:rPr>
-        <w:t xml:space="preserve">, </w:t>
-      </w:r>
-      <w:r>
-        <w:rPr>
-          <w:rFonts w:ascii="Source Sans Pro" w:hAnsi="Source Sans Pro"/>
-          <w:lang w:eastAsia="en-GB"/>
-        </w:rPr>
-        <w:t>Hayashibara</w:t>
-      </w:r>
-      <w:r>
-        <w:rPr>
-          <w:rFonts w:ascii="Source Sans Pro" w:hAnsi="Source Sans Pro"/>
-          <w:lang w:eastAsia="en-GB"/>
-        </w:rPr>
-        <w:t xml:space="preserve">, E., Arthur, T., Husselman, T., Savickaite, S., Taylor, R. (In </w:t>
-      </w:r>
-      <w:r>
-        <w:rPr>
-          <w:rFonts w:ascii="Source Sans Pro" w:hAnsi="Source Sans Pro"/>
-          <w:lang w:eastAsia="en-GB"/>
-        </w:rPr>
-        <w:t>Press</w:t>
-      </w:r>
-      <w:r>
-        <w:rPr>
-          <w:rFonts w:ascii="Source Sans Pro" w:hAnsi="Source Sans Pro"/>
-          <w:lang w:eastAsia="en-GB"/>
-        </w:rPr>
-        <w:t xml:space="preserve">). </w:t>
-      </w:r>
-      <w:r>
-        <w:rPr>
-          <w:rFonts w:ascii="Source Sans Pro" w:hAnsi="Source Sans Pro"/>
-          <w:lang w:eastAsia="en-GB"/>
-        </w:rPr>
-        <w:t>Neurodivergent Participatory Action Research in Virtual Reality (VR)</w:t>
-      </w:r>
-      <w:r>
-        <w:rPr>
-          <w:rFonts w:ascii="Source Sans Pro" w:hAnsi="Source Sans Pro"/>
-          <w:lang w:eastAsia="en-GB"/>
-        </w:rPr>
-        <w:t xml:space="preserve">. </w:t>
-      </w:r>
-      <w:r>
-        <w:rPr>
-          <w:rFonts w:ascii="Source Sans Pro" w:hAnsi="Source Sans Pro"/>
-          <w:i/>
-          <w:iCs/>
-          <w:lang w:eastAsia="en-GB"/>
-        </w:rPr>
-        <w:t>Journal of Enabling Technologies</w:t>
-      </w:r>
-      <w:r>
-        <w:rPr>
-          <w:rFonts w:ascii="Source Sans Pro" w:hAnsi="Source Sans Pro"/>
-          <w:lang w:eastAsia="en-GB"/>
-        </w:rPr>
-        <w:t>.</w:t>
-      </w:r>
-    </w:p>
-    <w:p>
-      <w:pPr>
-        <w:spacing w:after="100" w:afterAutospacing="1" w:line="240" w:lineRule="auto"/>
-        <w:ind w:left="720" w:hanging="720"/>
-        <w:rPr>
-          <w:rFonts w:ascii="Source Sans Pro" w:hAnsi="Source Sans Pro"/>
-          <w:lang w:eastAsia="en-GB"/>
-        </w:rPr>
-      </w:pPr>
-      <w:r>
-        <w:rPr>
-          <w:rFonts w:ascii="Source Sans Pro" w:hAnsi="Source Sans Pro"/>
-          <w:lang w:eastAsia="en-GB"/>
-        </w:rPr>
-        <w:t>Savickaite, S.,</w:t>
-      </w:r>
-      <w:r>
-        <w:rPr>
-          <w:rFonts w:ascii="Source Sans Pro" w:hAnsi="Source Sans Pro"/>
-          <w:lang w:eastAsia="en-GB"/>
-        </w:rPr>
-        <w:t xml:space="preserve"> Arthur, T., </w:t>
-      </w:r>
-      <w:r>
-        <w:rPr>
-          <w:rFonts w:ascii="Source Sans Pro" w:hAnsi="Source Sans Pro"/>
-          <w:b/>
-          <w:bCs/>
-          <w:lang w:eastAsia="en-GB"/>
-        </w:rPr>
-        <w:t>Millington, E.</w:t>
-      </w:r>
-      <w:r>
-        <w:rPr>
-          <w:rFonts w:ascii="Source Sans Pro" w:hAnsi="Source Sans Pro"/>
-          <w:lang w:eastAsia="en-GB"/>
-        </w:rPr>
-        <w:t xml:space="preserve">, Husselman, T., Taylor, R., </w:t>
-      </w:r>
-      <w:r>
-        <w:rPr>
-          <w:rFonts w:ascii="Source Sans Pro" w:hAnsi="Source Sans Pro"/>
-          <w:lang w:eastAsia="en-GB"/>
-        </w:rPr>
-        <w:t>Hayashibara</w:t>
-      </w:r>
-      <w:r>
-        <w:rPr>
-          <w:rFonts w:ascii="Source Sans Pro" w:hAnsi="Source Sans Pro"/>
-          <w:lang w:eastAsia="en-GB"/>
-        </w:rPr>
-        <w:t xml:space="preserve">, E. (In </w:t>
-      </w:r>
-      <w:r>
-        <w:rPr>
-          <w:rFonts w:ascii="Source Sans Pro" w:hAnsi="Source Sans Pro"/>
-          <w:lang w:eastAsia="en-GB"/>
-        </w:rPr>
-        <w:t>Press</w:t>
-      </w:r>
-      <w:r>
-        <w:rPr>
-          <w:rFonts w:ascii="Source Sans Pro" w:hAnsi="Source Sans Pro"/>
-          <w:lang w:eastAsia="en-GB"/>
-        </w:rPr>
-        <w:t xml:space="preserve">). </w:t>
-      </w:r>
-      <w:r>
-        <w:rPr>
-          <w:rFonts w:ascii="Source Sans Pro" w:hAnsi="Source Sans Pro"/>
-          <w:lang w:eastAsia="en-GB"/>
-        </w:rPr>
-        <w:t>Applications of Virtual Reality (VR) in Autism Research: Current trends and taxonomy of definitions</w:t>
-      </w:r>
-      <w:r>
-        <w:rPr>
-          <w:rFonts w:ascii="Source Sans Pro" w:hAnsi="Source Sans Pro"/>
-          <w:lang w:eastAsia="en-GB"/>
-        </w:rPr>
-        <w:t xml:space="preserve">. </w:t>
-      </w:r>
-      <w:r>
-        <w:rPr>
-          <w:rFonts w:ascii="Source Sans Pro" w:hAnsi="Source Sans Pro"/>
-          <w:i/>
-          <w:iCs/>
-          <w:lang w:eastAsia="en-GB"/>
-        </w:rPr>
-        <w:t>Journal of Enabling Technologies</w:t>
-      </w:r>
-      <w:r>
-        <w:rPr>
-          <w:rFonts w:ascii="Source Sans Pro" w:hAnsi="Source Sans Pro"/>
-          <w:lang w:eastAsia="en-GB"/>
-        </w:rPr>
-        <w:t>.</w:t>
-      </w:r>
-    </w:p>
-    <w:p>
-      <w:pPr>
         <w:pStyle w:val="Heading1"/>
-        <w:spacing w:before="100" w:beforeAutospacing="1" w:line="240" w:lineRule="auto"/>
-        <w:ind w:left="720" w:hanging="720"/>
-        <w:rPr>
-          <w:rFonts w:ascii="Source Sans Pro" w:hAnsi="Source Sans Pro"/>
-          <w:sz w:val="22"/>
-          <w:szCs w:val="22"/>
-        </w:rPr>
-      </w:pPr>
-      <w:r>
-        <w:rPr>
-          <w:rFonts w:ascii="Source Sans Pro" w:hAnsi="Source Sans Pro"/>
-          <w:sz w:val="22"/>
-          <w:szCs w:val="22"/>
-        </w:rPr>
+      </w:pPr>
+      <w:r>
         <w:t>Awards</w:t>
       </w:r>
     </w:p>
@@ -2061,27 +1922,31 @@
     <w:p>
       <w:pPr>
         <w:pStyle w:val="Heading1"/>
-        <w:spacing w:line="240" w:lineRule="auto"/>
-        <w:rPr>
-          <w:rFonts w:ascii="Source Sans Pro" w:hAnsi="Source Sans Pro"/>
-          <w:sz w:val="22"/>
-          <w:szCs w:val="22"/>
-        </w:rPr>
-      </w:pPr>
-      <w:r>
-        <w:rPr>
-          <w:rFonts w:ascii="Source Sans Pro" w:hAnsi="Source Sans Pro"/>
-          <w:sz w:val="22"/>
-          <w:szCs w:val="22"/>
-        </w:rPr>
+      </w:pPr>
+    </w:p>
+    <w:p>
+      <w:pPr>
+        <w:rPr>
+          <w:rFonts w:ascii="Source Sans Pro" w:eastAsiaTheme="majorEastAsia" w:hAnsi="Source Sans Pro" w:cstheme="majorBidi"/>
+          <w:b/>
+        </w:rPr>
+      </w:pPr>
+      <w:r>
+        <w:rPr>
+          <w:rFonts w:ascii="Source Sans Pro" w:hAnsi="Source Sans Pro"/>
+        </w:rPr>
+        <w:br w:type="page"/>
+      </w:r>
+    </w:p>
+    <w:p>
+      <w:pPr>
+        <w:pStyle w:val="Heading1"/>
+      </w:pPr>
+      <w:r>
+        <w:lastRenderedPageBreak/>
         <w:t xml:space="preserve">Conferences and </w:t>
       </w:r>
       <w:r>
-        <w:rPr>
-          <w:rFonts w:ascii="Source Sans Pro" w:hAnsi="Source Sans Pro"/>
-          <w:sz w:val="22"/>
-          <w:szCs w:val="22"/>
-        </w:rPr>
         <w:t>Invited Talks</w:t>
       </w:r>
     </w:p>
@@ -2289,7 +2154,6 @@
               <w:rPr>
                 <w:rFonts w:ascii="Source Sans Pro" w:hAnsi="Source Sans Pro"/>
               </w:rPr>
-              <w:lastRenderedPageBreak/>
               <w:t>2021</w:t>
             </w:r>
           </w:p>
@@ -2393,19 +2257,8 @@
     <w:p>
       <w:pPr>
         <w:pStyle w:val="Heading1"/>
-        <w:spacing w:line="240" w:lineRule="auto"/>
-        <w:rPr>
-          <w:rFonts w:ascii="Source Sans Pro" w:hAnsi="Source Sans Pro"/>
-          <w:sz w:val="22"/>
-          <w:szCs w:val="22"/>
-        </w:rPr>
-      </w:pPr>
-      <w:r>
-        <w:rPr>
-          <w:rFonts w:ascii="Source Sans Pro" w:hAnsi="Source Sans Pro"/>
-          <w:sz w:val="22"/>
-          <w:szCs w:val="22"/>
-        </w:rPr>
+      </w:pPr>
+      <w:r>
         <w:t>Related Professional Skills</w:t>
       </w:r>
     </w:p>
@@ -2523,19 +2376,8 @@
     <w:p>
       <w:pPr>
         <w:pStyle w:val="Heading1"/>
-        <w:spacing w:line="240" w:lineRule="auto"/>
-        <w:rPr>
-          <w:rFonts w:ascii="Source Sans Pro" w:hAnsi="Source Sans Pro"/>
-          <w:sz w:val="22"/>
-          <w:szCs w:val="22"/>
-        </w:rPr>
-      </w:pPr>
-      <w:r>
-        <w:rPr>
-          <w:rFonts w:ascii="Source Sans Pro" w:hAnsi="Source Sans Pro"/>
-          <w:sz w:val="22"/>
-          <w:szCs w:val="22"/>
-        </w:rPr>
+      </w:pPr>
+      <w:r>
         <w:t>Non-Academic Work</w:t>
       </w:r>
     </w:p>
@@ -2913,20 +2755,13 @@
     <w:p>
       <w:pPr>
         <w:pStyle w:val="Heading1"/>
-        <w:spacing w:line="240" w:lineRule="auto"/>
-        <w:rPr>
-          <w:rFonts w:ascii="Source Sans Pro" w:hAnsi="Source Sans Pro"/>
-          <w:sz w:val="22"/>
-          <w:szCs w:val="22"/>
-        </w:rPr>
-      </w:pPr>
-      <w:r>
-        <w:rPr>
-          <w:rFonts w:ascii="Source Sans Pro" w:hAnsi="Source Sans Pro"/>
-          <w:sz w:val="22"/>
-          <w:szCs w:val="22"/>
-        </w:rPr>
-        <w:t>Academic Services</w:t>
+      </w:pPr>
+      <w:r>
+        <w:lastRenderedPageBreak/>
+        <w:t>Academic</w:t>
+      </w:r>
+      <w:r>
+        <w:t xml:space="preserve"> Services</w:t>
       </w:r>
     </w:p>
     <w:tbl>
@@ -3096,19 +2931,8 @@
     <w:p>
       <w:pPr>
         <w:pStyle w:val="Heading1"/>
-        <w:spacing w:line="240" w:lineRule="auto"/>
-        <w:rPr>
-          <w:rFonts w:ascii="Source Sans Pro" w:hAnsi="Source Sans Pro"/>
-          <w:sz w:val="22"/>
-          <w:szCs w:val="22"/>
-        </w:rPr>
-      </w:pPr>
-      <w:r>
-        <w:rPr>
-          <w:rFonts w:ascii="Source Sans Pro" w:hAnsi="Source Sans Pro"/>
-          <w:sz w:val="22"/>
-          <w:szCs w:val="22"/>
-        </w:rPr>
+      </w:pPr>
+      <w:r>
         <w:t>Professional Affiliations</w:t>
       </w:r>
     </w:p>
@@ -3225,48 +3049,17 @@
     </w:tbl>
     <w:p>
       <w:pPr>
-        <w:rPr>
-          <w:rFonts w:ascii="Source Sans Pro" w:eastAsiaTheme="majorEastAsia" w:hAnsi="Source Sans Pro" w:cstheme="majorBidi"/>
-          <w:b/>
-        </w:rPr>
-      </w:pPr>
-      <w:r>
-        <w:rPr>
-          <w:rFonts w:ascii="Source Sans Pro" w:hAnsi="Source Sans Pro"/>
-        </w:rPr>
-        <w:br w:type="page"/>
+        <w:pStyle w:val="Heading1"/>
+      </w:pPr>
+      <w:r>
+        <w:t>R</w:t>
+      </w:r>
+      <w:r>
+        <w:t>eferences</w:t>
       </w:r>
     </w:p>
     <w:p>
       <w:pPr>
-        <w:pStyle w:val="Heading1"/>
-        <w:spacing w:line="240" w:lineRule="auto"/>
-        <w:rPr>
-          <w:rFonts w:ascii="Source Sans Pro" w:hAnsi="Source Sans Pro"/>
-          <w:sz w:val="22"/>
-          <w:szCs w:val="22"/>
-        </w:rPr>
-      </w:pPr>
-      <w:r>
-        <w:rPr>
-          <w:rFonts w:ascii="Source Sans Pro" w:hAnsi="Source Sans Pro"/>
-          <w:sz w:val="22"/>
-          <w:szCs w:val="22"/>
-        </w:rPr>
-        <w:lastRenderedPageBreak/>
-        <w:t>R</w:t>
-      </w:r>
-      <w:r>
-        <w:rPr>
-          <w:rFonts w:ascii="Source Sans Pro" w:hAnsi="Source Sans Pro"/>
-          <w:sz w:val="22"/>
-          <w:szCs w:val="22"/>
-        </w:rPr>
-        <w:t>eferences</w:t>
-      </w:r>
-    </w:p>
-    <w:p>
-      <w:pPr>
         <w:spacing w:line="240" w:lineRule="auto"/>
         <w:rPr>
           <w:rFonts w:ascii="Source Sans Pro" w:hAnsi="Source Sans Pro"/>
@@ -3362,7 +3155,7 @@
         </w:rPr>
         <w:br/>
       </w:r>
-      <w:hyperlink r:id="rId16" w:history="1">
+      <w:hyperlink r:id="rId18" w:history="1">
         <w:r>
           <w:rPr>
             <w:rStyle w:val="Hyperlink"/>
@@ -3421,7 +3214,7 @@
         </w:rPr>
         <w:br/>
       </w:r>
-      <w:hyperlink r:id="rId17" w:history="1">
+      <w:hyperlink r:id="rId19" w:history="1">
         <w:r>
           <w:rPr>
             <w:rStyle w:val="Hyperlink"/>
@@ -3503,7 +3296,7 @@
         </w:rPr>
         <w:br/>
       </w:r>
-      <w:hyperlink r:id="rId18" w:history="1">
+      <w:hyperlink r:id="rId20" w:history="1">
         <w:r>
           <w:rPr>
             <w:rStyle w:val="Hyperlink"/>
@@ -3514,7 +3307,7 @@
       </w:hyperlink>
     </w:p>
     <w:sectPr>
-      <w:footerReference w:type="default" r:id="rId19"/>
+      <w:footerReference w:type="default" r:id="rId21"/>
       <w:pgSz w:w="11906" w:h="16838"/>
       <w:pgMar w:top="1440" w:right="1440" w:bottom="1440" w:left="1440" w:header="708" w:footer="708" w:gutter="0"/>
       <w:cols w:space="708"/>
@@ -4442,18 +4235,16 @@
     <w:link w:val="Heading1Char"/>
     <w:uiPriority w:val="9"/>
     <w:qFormat/>
-    <w:rsid w:val="00064AFD"/>
+    <w:rsid w:val="0038396E"/>
     <w:pPr>
       <w:keepNext/>
       <w:keepLines/>
-      <w:spacing w:before="360" w:after="120"/>
+      <w:spacing w:before="360" w:after="120" w:line="240" w:lineRule="auto"/>
       <w:outlineLvl w:val="0"/>
     </w:pPr>
     <w:rPr>
-      <w:rFonts w:asciiTheme="majorHAnsi" w:eastAsiaTheme="majorEastAsia" w:hAnsiTheme="majorHAnsi" w:cstheme="majorBidi"/>
+      <w:rFonts w:ascii="Source Sans Pro" w:eastAsiaTheme="majorEastAsia" w:hAnsi="Source Sans Pro" w:cstheme="majorBidi"/>
       <w:b/>
-      <w:sz w:val="24"/>
-      <w:szCs w:val="32"/>
     </w:rPr>
   </w:style>
   <w:style w:type="paragraph" w:styleId="Heading2">
@@ -4551,12 +4342,10 @@
     <w:basedOn w:val="DefaultParagraphFont"/>
     <w:link w:val="Heading1"/>
     <w:uiPriority w:val="9"/>
-    <w:rsid w:val="00064AFD"/>
+    <w:rsid w:val="0038396E"/>
     <w:rPr>
-      <w:rFonts w:asciiTheme="majorHAnsi" w:eastAsiaTheme="majorEastAsia" w:hAnsiTheme="majorHAnsi" w:cstheme="majorBidi"/>
+      <w:rFonts w:ascii="Source Sans Pro" w:eastAsiaTheme="majorEastAsia" w:hAnsi="Source Sans Pro" w:cstheme="majorBidi"/>
       <w:b/>
-      <w:sz w:val="24"/>
-      <w:szCs w:val="32"/>
     </w:rPr>
   </w:style>
   <w:style w:type="paragraph" w:styleId="Header">
@@ -4641,6 +4430,31 @@
       <w:ind w:left="720"/>
       <w:contextualSpacing/>
     </w:pPr>
+  </w:style>
+  <w:style w:type="paragraph" w:customStyle="1" w:styleId="Reference">
+    <w:name w:val="Reference"/>
+    <w:basedOn w:val="Normal"/>
+    <w:link w:val="ReferenceChar"/>
+    <w:qFormat/>
+    <w:rsid w:val="00E77002"/>
+    <w:pPr>
+      <w:spacing w:after="100" w:afterAutospacing="1" w:line="240" w:lineRule="auto"/>
+      <w:ind w:left="720" w:hanging="720"/>
+    </w:pPr>
+    <w:rPr>
+      <w:rFonts w:ascii="Source Sans Pro" w:hAnsi="Source Sans Pro"/>
+      <w:lang w:eastAsia="en-GB"/>
+    </w:rPr>
+  </w:style>
+  <w:style w:type="character" w:customStyle="1" w:styleId="ReferenceChar">
+    <w:name w:val="Reference Char"/>
+    <w:basedOn w:val="DefaultParagraphFont"/>
+    <w:link w:val="Reference"/>
+    <w:rsid w:val="00E77002"/>
+    <w:rPr>
+      <w:rFonts w:ascii="Source Sans Pro" w:hAnsi="Source Sans Pro"/>
+      <w:lang w:eastAsia="en-GB"/>
+    </w:rPr>
   </w:style>
 </w:styles>
 </file>
@@ -4941,12 +4755,6 @@
 </file>
 
 <file path=customXml/item1.xml><?xml version="1.0" encoding="utf-8"?>
-<p:properties xmlns:p="http://schemas.microsoft.com/office/2006/metadata/properties" xmlns:xsi="http://www.w3.org/2001/XMLSchema-instance" xmlns:pc="http://schemas.microsoft.com/office/infopath/2007/PartnerControls">
-  <documentManagement/>
-</p:properties>
-</file>
-
-<file path=customXml/item2.xml><?xml version="1.0" encoding="utf-8"?>
 <ct:contentTypeSchema xmlns:ct="http://schemas.microsoft.com/office/2006/metadata/contentType" xmlns:ma="http://schemas.microsoft.com/office/2006/metadata/properties/metaAttributes" ct:_="" ma:_="" ma:contentTypeName="Document" ma:contentTypeID="0x0101004E0AC046D158EE4DB937DA9A56D27D1C" ma:contentTypeVersion="10" ma:contentTypeDescription="Create a new document." ma:contentTypeScope="" ma:versionID="f1b105e6b9cff91feb409560dbf6f7aa">
   <xsd:schema xmlns:xsd="http://www.w3.org/2001/XMLSchema" xmlns:xs="http://www.w3.org/2001/XMLSchema" xmlns:p="http://schemas.microsoft.com/office/2006/metadata/properties" xmlns:ns3="b24ac480-a0b1-4388-a6cd-cfb001cdf6c7" xmlns:ns4="e7d8f92c-3952-4b7d-acc4-88cf8f2f7888" targetNamespace="http://schemas.microsoft.com/office/2006/metadata/properties" ma:root="true" ma:fieldsID="8ce9a1263d385fff90f75fc0f277280b" ns3:_="" ns4:_="">
     <xsd:import namespace="b24ac480-a0b1-4388-a6cd-cfb001cdf6c7"/>
@@ -5149,11 +4957,13 @@
 </ct:contentTypeSchema>
 </file>
 
-<file path=customXml/item3.xml><?xml version="1.0" encoding="utf-8"?>
-<b:Sources xmlns:b="http://schemas.openxmlformats.org/officeDocument/2006/bibliography" xmlns="http://schemas.openxmlformats.org/officeDocument/2006/bibliography" SelectedStyle="\APASixthEditionOfficeOnline.xsl" StyleName="APA" Version="6"/>
+<file path=customXml/item2.xml><?xml version="1.0" encoding="utf-8"?>
+<p:properties xmlns:p="http://schemas.microsoft.com/office/2006/metadata/properties" xmlns:xsi="http://www.w3.org/2001/XMLSchema-instance" xmlns:pc="http://schemas.microsoft.com/office/infopath/2007/PartnerControls">
+  <documentManagement/>
+</p:properties>
 </file>
 
-<file path=customXml/item4.xml><?xml version="1.0" encoding="utf-8"?>
+<file path=customXml/item3.xml><?xml version="1.0" encoding="utf-8"?>
 <?mso-contentType ?>
 <FormTemplates xmlns="http://schemas.microsoft.com/sharepoint/v3/contenttype/forms">
   <Display>DocumentLibraryForm</Display>
@@ -5162,16 +4972,11 @@
 </FormTemplates>
 </file>
 
-<file path=customXml/itemProps1.xml><?xml version="1.0" encoding="utf-8"?>
-<ds:datastoreItem xmlns:ds="http://schemas.openxmlformats.org/officeDocument/2006/customXml" ds:itemID="{DD97F3C8-62EE-4BC5-A92B-F4DA5CE92DF8}">
-  <ds:schemaRefs>
-    <ds:schemaRef ds:uri="http://schemas.microsoft.com/office/2006/metadata/properties"/>
-    <ds:schemaRef ds:uri="http://schemas.microsoft.com/office/infopath/2007/PartnerControls"/>
-  </ds:schemaRefs>
-</ds:datastoreItem>
+<file path=customXml/item4.xml><?xml version="1.0" encoding="utf-8"?>
+<b:Sources xmlns:b="http://schemas.openxmlformats.org/officeDocument/2006/bibliography" xmlns="http://schemas.openxmlformats.org/officeDocument/2006/bibliography" SelectedStyle="\APASixthEditionOfficeOnline.xsl" StyleName="APA" Version="6"/>
 </file>
 
-<file path=customXml/itemProps2.xml><?xml version="1.0" encoding="utf-8"?>
+<file path=customXml/itemProps1.xml><?xml version="1.0" encoding="utf-8"?>
 <ds:datastoreItem xmlns:ds="http://schemas.openxmlformats.org/officeDocument/2006/customXml" ds:itemID="{11E413AD-A691-4C16-BEE5-5C367C5D236C}">
   <ds:schemaRefs>
     <ds:schemaRef ds:uri="http://schemas.microsoft.com/office/2006/metadata/contentType"/>
@@ -5190,18 +4995,27 @@
 </ds:datastoreItem>
 </file>
 
+<file path=customXml/itemProps2.xml><?xml version="1.0" encoding="utf-8"?>
+<ds:datastoreItem xmlns:ds="http://schemas.openxmlformats.org/officeDocument/2006/customXml" ds:itemID="{DD97F3C8-62EE-4BC5-A92B-F4DA5CE92DF8}">
+  <ds:schemaRefs>
+    <ds:schemaRef ds:uri="http://schemas.microsoft.com/office/2006/metadata/properties"/>
+    <ds:schemaRef ds:uri="http://schemas.microsoft.com/office/infopath/2007/PartnerControls"/>
+  </ds:schemaRefs>
+</ds:datastoreItem>
+</file>
+
 <file path=customXml/itemProps3.xml><?xml version="1.0" encoding="utf-8"?>
+<ds:datastoreItem xmlns:ds="http://schemas.openxmlformats.org/officeDocument/2006/customXml" ds:itemID="{4C53A478-4862-4699-9810-166E8FEE5B0D}">
+  <ds:schemaRefs>
+    <ds:schemaRef ds:uri="http://schemas.microsoft.com/sharepoint/v3/contenttype/forms"/>
+  </ds:schemaRefs>
+</ds:datastoreItem>
+</file>
+
+<file path=customXml/itemProps4.xml><?xml version="1.0" encoding="utf-8"?>
 <ds:datastoreItem xmlns:ds="http://schemas.openxmlformats.org/officeDocument/2006/customXml" ds:itemID="{A9BA2174-033C-45ED-94FB-74A1FBFA3035}">
   <ds:schemaRefs>
     <ds:schemaRef ds:uri="http://schemas.openxmlformats.org/officeDocument/2006/bibliography"/>
   </ds:schemaRefs>
 </ds:datastoreItem>
-</file>
-
-<file path=customXml/itemProps4.xml><?xml version="1.0" encoding="utf-8"?>
-<ds:datastoreItem xmlns:ds="http://schemas.openxmlformats.org/officeDocument/2006/customXml" ds:itemID="{4C53A478-4862-4699-9810-166E8FEE5B0D}">
-  <ds:schemaRefs>
-    <ds:schemaRef ds:uri="http://schemas.microsoft.com/sharepoint/v3/contenttype/forms"/>
-  </ds:schemaRefs>
-</ds:datastoreItem>
 </file>
</xml_diff>

<commit_message>
rebuilding site Mon Aug 14 20:37:47 GMTST 2023
</commit_message>
<xml_diff>
--- a/files/cv.docx
+++ b/files/cv.docx
@@ -478,21 +478,7 @@
               <w:rPr>
                 <w:rFonts w:ascii="Source Sans Pro" w:hAnsi="Source Sans Pro"/>
               </w:rPr>
-              <w:t>MA (</w:t>
-            </w:r>
-            <w:proofErr w:type="spellStart"/>
-            <w:r>
-              <w:rPr>
-                <w:rFonts w:ascii="Source Sans Pro" w:hAnsi="Source Sans Pro"/>
-              </w:rPr>
-              <w:t>SocSci</w:t>
-            </w:r>
-            <w:proofErr w:type="spellEnd"/>
-            <w:r>
-              <w:rPr>
-                <w:rFonts w:ascii="Source Sans Pro" w:hAnsi="Source Sans Pro"/>
-              </w:rPr>
-              <w:t>) in Psychology (1</w:t>
+              <w:t>MA (SocSci) in Psychology (1</w:t>
             </w:r>
             <w:r>
               <w:rPr>
@@ -659,13 +645,7 @@
               <w:rPr>
                 <w:rFonts w:ascii="Source Sans Pro" w:hAnsi="Source Sans Pro"/>
               </w:rPr>
-              <w:t>p</w:t>
-            </w:r>
-            <w:r>
-              <w:rPr>
-                <w:rFonts w:ascii="Source Sans Pro" w:hAnsi="Source Sans Pro"/>
-              </w:rPr>
-              <w:t>resent</w:t>
+              <w:t>2023</w:t>
             </w:r>
           </w:p>
         </w:tc>
@@ -1458,6 +1438,32 @@
     </w:p>
     <w:p>
       <w:pPr>
+        <w:pStyle w:val="Reference"/>
+      </w:pPr>
+      <w:r>
+        <w:rPr>
+          <w:b/>
+          <w:bCs/>
+        </w:rPr>
+        <w:t>Millington, E.</w:t>
+      </w:r>
+      <w:r>
+        <w:t xml:space="preserve">, &amp; Simmons, D. (2023, July 10). Development and Validation of the Glasgow Sensory Questionnaire Short (GSQ-14). </w:t>
+      </w:r>
+      <w:hyperlink r:id="rId15" w:history="1">
+        <w:r>
+          <w:rPr>
+            <w:rStyle w:val="Hyperlink"/>
+          </w:rPr>
+          <w:t>https://doi.org/10.31234/osf.io/84kgt</w:t>
+        </w:r>
+      </w:hyperlink>
+      <w:r>
+        <w:t xml:space="preserve"> </w:t>
+      </w:r>
+    </w:p>
+    <w:p>
+      <w:pPr>
         <w:spacing w:after="100" w:afterAutospacing="1" w:line="240" w:lineRule="auto"/>
         <w:ind w:left="720" w:hanging="720"/>
         <w:rPr>
@@ -1495,7 +1501,7 @@
         </w:rPr>
         <w:t xml:space="preserve">Freeman, C., McMillan, R., McDonnell, N., &amp; Khamis, M. (2022, June 20). ALIVE: Avatar Learning Impact Assessment for Virtual Environments. </w:t>
       </w:r>
-      <w:hyperlink r:id="rId15" w:history="1">
+      <w:hyperlink r:id="rId16" w:history="1">
         <w:r>
           <w:rPr>
             <w:rStyle w:val="Hyperlink"/>
@@ -1543,32 +1549,16 @@
           <w:rFonts w:ascii="Source Sans Pro" w:hAnsi="Source Sans Pro"/>
           <w:lang w:eastAsia="en-GB"/>
         </w:rPr>
-        <w:t xml:space="preserve">, </w:t>
-      </w:r>
-      <w:proofErr w:type="spellStart"/>
+        <w:t>, Latkovskis, I., Failes, J., Kirkwood, N., &amp; McDonnell, N. (2022, January 11). Virtual Reality (VR) Multi-User Lab for Immersive Teaching.</w:t>
+      </w:r>
       <w:r>
         <w:rPr>
           <w:rFonts w:ascii="Source Sans Pro" w:hAnsi="Source Sans Pro"/>
           <w:lang w:eastAsia="en-GB"/>
         </w:rPr>
-        <w:t>Latkovskis</w:t>
-      </w:r>
-      <w:proofErr w:type="spellEnd"/>
-      <w:r>
-        <w:rPr>
-          <w:rFonts w:ascii="Source Sans Pro" w:hAnsi="Source Sans Pro"/>
-          <w:lang w:eastAsia="en-GB"/>
-        </w:rPr>
-        <w:t>, I., Failes, J., Kirkwood, N., &amp; McDonnell, N. (2022, January 11). Virtual Reality (VR) Multi-User Lab for Immersive Teaching.</w:t>
-      </w:r>
-      <w:r>
-        <w:rPr>
-          <w:rFonts w:ascii="Source Sans Pro" w:hAnsi="Source Sans Pro"/>
-          <w:lang w:eastAsia="en-GB"/>
-        </w:rPr>
         <w:br/>
       </w:r>
-      <w:hyperlink r:id="rId16" w:history="1">
+      <w:hyperlink r:id="rId17" w:history="1">
         <w:r>
           <w:rPr>
             <w:rStyle w:val="Hyperlink"/>
@@ -1594,9 +1584,6 @@
         </w:rPr>
       </w:pPr>
       <w:r>
-        <w:t xml:space="preserve">Brown, L., </w:t>
-      </w:r>
-      <w:r>
         <w:rPr>
           <w:b/>
         </w:rPr>
@@ -1609,9 +1596,21 @@
         <w:t>.</w:t>
       </w:r>
       <w:r>
-        <w:t xml:space="preserve">, Robertson, A. E., &amp; Simmons, D. (2021, April 27). Children’s Glasgow Sensory Questionnaire (C-GSQ): Validation of a Simplified and Visually Aided Questionnaire. </w:t>
-      </w:r>
-      <w:hyperlink r:id="rId17" w:history="1">
+        <w:t xml:space="preserve">, </w:t>
+      </w:r>
+      <w:r>
+        <w:t xml:space="preserve">Brown, L., McMahon, H., </w:t>
+      </w:r>
+      <w:r>
+        <w:t>Robertson, A. E., &amp; Simmons, D.</w:t>
+      </w:r>
+      <w:r>
+        <w:t>R.</w:t>
+      </w:r>
+      <w:r>
+        <w:t xml:space="preserve"> (2021, April 27). Children’s Glasgow Sensory Questionnaire (C-GSQ): Validation of a Simplified and Visually Aided Questionnaire. </w:t>
+      </w:r>
+      <w:hyperlink r:id="rId18" w:history="1">
         <w:r>
           <w:rPr>
             <w:rStyle w:val="Hyperlink"/>
@@ -1984,6 +1983,82 @@
               <w:rPr>
                 <w:rFonts w:ascii="Source Sans Pro" w:hAnsi="Source Sans Pro"/>
               </w:rPr>
+              <w:t>2023</w:t>
+            </w:r>
+          </w:p>
+        </w:tc>
+        <w:tc>
+          <w:tcPr>
+            <w:tcW w:w="7485" w:type="dxa"/>
+          </w:tcPr>
+          <w:p>
+            <w:pPr>
+              <w:rPr>
+                <w:rFonts w:ascii="Source Sans Pro" w:hAnsi="Source Sans Pro"/>
+              </w:rPr>
+            </w:pPr>
+            <w:r>
+              <w:rPr>
+                <w:rFonts w:ascii="Source Sans Pro" w:hAnsi="Source Sans Pro"/>
+              </w:rPr>
+              <w:t>International Society of Autism Research Poster on GSQ-14: A Short Version of the Glasgow Sensory Questionnaire</w:t>
+            </w:r>
+          </w:p>
+        </w:tc>
+      </w:tr>
+      <w:tr>
+        <w:tc>
+          <w:tcPr>
+            <w:tcW w:w="1588" w:type="dxa"/>
+          </w:tcPr>
+          <w:p>
+            <w:pPr>
+              <w:rPr>
+                <w:rFonts w:ascii="Source Sans Pro" w:hAnsi="Source Sans Pro"/>
+              </w:rPr>
+            </w:pPr>
+            <w:r>
+              <w:rPr>
+                <w:rFonts w:ascii="Source Sans Pro" w:hAnsi="Source Sans Pro"/>
+              </w:rPr>
+              <w:t>2023</w:t>
+            </w:r>
+          </w:p>
+        </w:tc>
+        <w:tc>
+          <w:tcPr>
+            <w:tcW w:w="7485" w:type="dxa"/>
+          </w:tcPr>
+          <w:p>
+            <w:pPr>
+              <w:rPr>
+                <w:rFonts w:ascii="Source Sans Pro" w:hAnsi="Source Sans Pro"/>
+              </w:rPr>
+            </w:pPr>
+            <w:r>
+              <w:rPr>
+                <w:rFonts w:ascii="Source Sans Pro" w:hAnsi="Source Sans Pro"/>
+              </w:rPr>
+              <w:t>It Takes All Kinds of Minds Poster on Preliminary Analysis of Autistic Experiences of Sensory Overload</w:t>
+            </w:r>
+          </w:p>
+        </w:tc>
+      </w:tr>
+      <w:tr>
+        <w:tc>
+          <w:tcPr>
+            <w:tcW w:w="1588" w:type="dxa"/>
+          </w:tcPr>
+          <w:p>
+            <w:pPr>
+              <w:rPr>
+                <w:rFonts w:ascii="Source Sans Pro" w:hAnsi="Source Sans Pro"/>
+              </w:rPr>
+            </w:pPr>
+            <w:r>
+              <w:rPr>
+                <w:rFonts w:ascii="Source Sans Pro" w:hAnsi="Source Sans Pro"/>
+              </w:rPr>
               <w:t>2022</w:t>
             </w:r>
           </w:p>
@@ -2404,6 +2479,150 @@
         <w:tc>
           <w:tcPr>
             <w:tcW w:w="1588" w:type="dxa"/>
+            <w:vMerge w:val="restart"/>
+          </w:tcPr>
+          <w:p>
+            <w:pPr>
+              <w:rPr>
+                <w:rFonts w:ascii="Source Sans Pro" w:hAnsi="Source Sans Pro"/>
+              </w:rPr>
+            </w:pPr>
+            <w:r>
+              <w:rPr>
+                <w:rFonts w:ascii="Source Sans Pro" w:hAnsi="Source Sans Pro"/>
+              </w:rPr>
+              <w:t xml:space="preserve">2022 </w:t>
+            </w:r>
+            <w:r>
+              <w:rPr>
+                <w:rFonts w:ascii="Source Sans Pro" w:hAnsi="Source Sans Pro"/>
+              </w:rPr>
+              <w:t>–</w:t>
+            </w:r>
+            <w:r>
+              <w:rPr>
+                <w:rFonts w:ascii="Source Sans Pro" w:hAnsi="Source Sans Pro"/>
+              </w:rPr>
+              <w:t xml:space="preserve"> present</w:t>
+            </w:r>
+          </w:p>
+        </w:tc>
+        <w:tc>
+          <w:tcPr>
+            <w:tcW w:w="7343" w:type="dxa"/>
+          </w:tcPr>
+          <w:p>
+            <w:pPr>
+              <w:rPr>
+                <w:rFonts w:ascii="Source Sans Pro" w:hAnsi="Source Sans Pro"/>
+              </w:rPr>
+            </w:pPr>
+            <w:r>
+              <w:rPr>
+                <w:rFonts w:ascii="Source Sans Pro" w:hAnsi="Source Sans Pro"/>
+              </w:rPr>
+              <w:t>Information Analyst</w:t>
+            </w:r>
+          </w:p>
+        </w:tc>
+      </w:tr>
+      <w:tr>
+        <w:tc>
+          <w:tcPr>
+            <w:tcW w:w="1588" w:type="dxa"/>
+            <w:vMerge/>
+          </w:tcPr>
+          <w:p>
+            <w:pPr>
+              <w:rPr>
+                <w:rFonts w:ascii="Source Sans Pro" w:hAnsi="Source Sans Pro"/>
+              </w:rPr>
+            </w:pPr>
+          </w:p>
+        </w:tc>
+        <w:tc>
+          <w:tcPr>
+            <w:tcW w:w="7343" w:type="dxa"/>
+          </w:tcPr>
+          <w:p>
+            <w:pPr>
+              <w:rPr>
+                <w:rFonts w:ascii="Source Sans Pro" w:hAnsi="Source Sans Pro"/>
+              </w:rPr>
+            </w:pPr>
+            <w:r>
+              <w:rPr>
+                <w:rFonts w:ascii="Source Sans Pro" w:hAnsi="Source Sans Pro"/>
+              </w:rPr>
+              <w:t>Glasgow Association of Mental Health</w:t>
+            </w:r>
+          </w:p>
+        </w:tc>
+      </w:tr>
+      <w:tr>
+        <w:tc>
+          <w:tcPr>
+            <w:tcW w:w="1588" w:type="dxa"/>
+            <w:vMerge/>
+          </w:tcPr>
+          <w:p>
+            <w:pPr>
+              <w:rPr>
+                <w:rFonts w:ascii="Source Sans Pro" w:hAnsi="Source Sans Pro"/>
+              </w:rPr>
+            </w:pPr>
+          </w:p>
+        </w:tc>
+        <w:tc>
+          <w:tcPr>
+            <w:tcW w:w="7343" w:type="dxa"/>
+          </w:tcPr>
+          <w:p>
+            <w:pPr>
+              <w:rPr>
+                <w:rFonts w:ascii="Source Sans Pro" w:hAnsi="Source Sans Pro"/>
+              </w:rPr>
+            </w:pPr>
+            <w:r>
+              <w:rPr>
+                <w:rFonts w:ascii="Source Sans Pro" w:hAnsi="Source Sans Pro"/>
+              </w:rPr>
+              <w:t>Using a Customer Management Database to develop data reports to fulfil charity legal requirements and respond to business needs and development.</w:t>
+            </w:r>
+          </w:p>
+        </w:tc>
+      </w:tr>
+      <w:tr>
+        <w:tc>
+          <w:tcPr>
+            <w:tcW w:w="1588" w:type="dxa"/>
+            <w:vMerge/>
+          </w:tcPr>
+          <w:p>
+            <w:pPr>
+              <w:rPr>
+                <w:rFonts w:ascii="Source Sans Pro" w:hAnsi="Source Sans Pro"/>
+              </w:rPr>
+            </w:pPr>
+          </w:p>
+        </w:tc>
+        <w:tc>
+          <w:tcPr>
+            <w:tcW w:w="7343" w:type="dxa"/>
+          </w:tcPr>
+          <w:p>
+            <w:pPr>
+              <w:rPr>
+                <w:rFonts w:ascii="Source Sans Pro" w:hAnsi="Source Sans Pro"/>
+              </w:rPr>
+            </w:pPr>
+          </w:p>
+        </w:tc>
+      </w:tr>
+      <w:tr>
+        <w:tc>
+          <w:tcPr>
+            <w:tcW w:w="1588" w:type="dxa"/>
           </w:tcPr>
           <w:p>
             <w:pPr>
@@ -2453,6 +2672,12 @@
                 <w:rFonts w:ascii="Source Sans Pro" w:hAnsi="Source Sans Pro"/>
               </w:rPr>
             </w:pPr>
+            <w:r>
+              <w:rPr>
+                <w:rFonts w:ascii="Source Sans Pro" w:hAnsi="Source Sans Pro"/>
+              </w:rPr>
+              <w:t xml:space="preserve">PhD </w:t>
+            </w:r>
             <w:r>
               <w:rPr>
                 <w:rFonts w:ascii="Source Sans Pro" w:hAnsi="Source Sans Pro"/>
@@ -2486,6 +2711,7 @@
         <w:tc>
           <w:tcPr>
             <w:tcW w:w="1588" w:type="dxa"/>
+            <w:vMerge w:val="restart"/>
           </w:tcPr>
           <w:p>
             <w:pPr>
@@ -2524,19 +2750,11 @@
                 <w:rFonts w:ascii="Source Sans Pro" w:hAnsi="Source Sans Pro"/>
               </w:rPr>
             </w:pPr>
-            <w:proofErr w:type="spellStart"/>
-            <w:r>
-              <w:rPr>
-                <w:rFonts w:ascii="Source Sans Pro" w:hAnsi="Source Sans Pro"/>
-              </w:rPr>
-              <w:t>Creatovators</w:t>
-            </w:r>
-            <w:proofErr w:type="spellEnd"/>
-            <w:r>
-              <w:rPr>
-                <w:rFonts w:ascii="Source Sans Pro" w:hAnsi="Source Sans Pro"/>
-              </w:rPr>
-              <w:t xml:space="preserve"> CIC</w:t>
+            <w:r>
+              <w:rPr>
+                <w:rFonts w:ascii="Source Sans Pro" w:hAnsi="Source Sans Pro"/>
+              </w:rPr>
+              <w:t>Creatovators CIC</w:t>
             </w:r>
           </w:p>
         </w:tc>
@@ -2545,6 +2763,7 @@
         <w:tc>
           <w:tcPr>
             <w:tcW w:w="1588" w:type="dxa"/>
+            <w:vMerge/>
           </w:tcPr>
           <w:p>
             <w:pPr>
@@ -2577,6 +2796,7 @@
         <w:tc>
           <w:tcPr>
             <w:tcW w:w="1588" w:type="dxa"/>
+            <w:vMerge/>
           </w:tcPr>
           <w:p>
             <w:pPr>
@@ -2596,168 +2816,193 @@
                 <w:rFonts w:ascii="Source Sans Pro" w:hAnsi="Source Sans Pro"/>
               </w:rPr>
             </w:pPr>
-          </w:p>
-        </w:tc>
-      </w:tr>
-      <w:tr>
-        <w:tc>
-          <w:tcPr>
-            <w:tcW w:w="1588" w:type="dxa"/>
-          </w:tcPr>
-          <w:p>
-            <w:pPr>
-              <w:rPr>
-                <w:rFonts w:ascii="Source Sans Pro" w:hAnsi="Source Sans Pro"/>
-              </w:rPr>
-            </w:pPr>
-            <w:r>
-              <w:rPr>
-                <w:rFonts w:ascii="Source Sans Pro" w:hAnsi="Source Sans Pro"/>
-              </w:rPr>
-              <w:t xml:space="preserve">2020 </w:t>
-            </w:r>
-            <w:r>
-              <w:rPr>
-                <w:rFonts w:ascii="Source Sans Pro" w:hAnsi="Source Sans Pro"/>
-              </w:rPr>
-              <w:t xml:space="preserve">– </w:t>
-            </w:r>
-            <w:r>
-              <w:rPr>
-                <w:rFonts w:ascii="Source Sans Pro" w:hAnsi="Source Sans Pro"/>
-              </w:rPr>
-              <w:t>2022</w:t>
-            </w:r>
-          </w:p>
-        </w:tc>
-        <w:tc>
-          <w:tcPr>
-            <w:tcW w:w="7343" w:type="dxa"/>
-          </w:tcPr>
-          <w:p>
-            <w:pPr>
-              <w:rPr>
-                <w:rFonts w:ascii="Source Sans Pro" w:hAnsi="Source Sans Pro"/>
-              </w:rPr>
-            </w:pPr>
-            <w:r>
-              <w:rPr>
-                <w:rFonts w:ascii="Source Sans Pro" w:hAnsi="Source Sans Pro"/>
-              </w:rPr>
-              <w:t>Academic Communities Coordinator</w:t>
-            </w:r>
-            <w:r>
-              <w:rPr>
-                <w:rFonts w:ascii="Source Sans Pro" w:hAnsi="Source Sans Pro"/>
-              </w:rPr>
-              <w:br/>
-              <w:t>Sublime Digital Ltd.</w:t>
-            </w:r>
-          </w:p>
-          <w:p>
-            <w:pPr>
-              <w:rPr>
-                <w:rFonts w:ascii="Source Sans Pro" w:hAnsi="Source Sans Pro"/>
-              </w:rPr>
-            </w:pPr>
-            <w:r>
-              <w:rPr>
-                <w:rFonts w:ascii="Source Sans Pro" w:hAnsi="Source Sans Pro"/>
-              </w:rPr>
-              <w:t xml:space="preserve">Managed academic stakeholders in the development of a VR teaching platform using a combination of planned events and personal communications. </w:t>
-            </w:r>
-            <w:r>
-              <w:rPr>
-                <w:rFonts w:ascii="Source Sans Pro" w:hAnsi="Source Sans Pro"/>
-              </w:rPr>
-              <w:br/>
-            </w:r>
-          </w:p>
-        </w:tc>
-      </w:tr>
-      <w:tr>
-        <w:tc>
-          <w:tcPr>
-            <w:tcW w:w="1588" w:type="dxa"/>
-          </w:tcPr>
-          <w:p>
-            <w:pPr>
-              <w:rPr>
-                <w:rFonts w:ascii="Source Sans Pro" w:hAnsi="Source Sans Pro"/>
-              </w:rPr>
-            </w:pPr>
-            <w:r>
-              <w:rPr>
-                <w:rFonts w:ascii="Source Sans Pro" w:hAnsi="Source Sans Pro"/>
-              </w:rPr>
-              <w:t xml:space="preserve">2020 </w:t>
-            </w:r>
-            <w:r>
-              <w:rPr>
-                <w:rFonts w:ascii="Source Sans Pro" w:hAnsi="Source Sans Pro"/>
-              </w:rPr>
-              <w:t xml:space="preserve">– </w:t>
-            </w:r>
-            <w:r>
-              <w:rPr>
-                <w:rFonts w:ascii="Source Sans Pro" w:hAnsi="Source Sans Pro"/>
-              </w:rPr>
-              <w:t>2021</w:t>
-            </w:r>
-          </w:p>
-        </w:tc>
-        <w:tc>
-          <w:tcPr>
-            <w:tcW w:w="7343" w:type="dxa"/>
-          </w:tcPr>
-          <w:p>
-            <w:pPr>
-              <w:rPr>
-                <w:rFonts w:ascii="Source Sans Pro" w:hAnsi="Source Sans Pro"/>
-              </w:rPr>
-            </w:pPr>
-            <w:r>
-              <w:rPr>
-                <w:rFonts w:ascii="Source Sans Pro" w:hAnsi="Source Sans Pro"/>
-              </w:rPr>
-              <w:t>Demonstrator</w:t>
-            </w:r>
-          </w:p>
-          <w:p>
-            <w:pPr>
-              <w:rPr>
-                <w:rFonts w:ascii="Source Sans Pro" w:hAnsi="Source Sans Pro"/>
-              </w:rPr>
-            </w:pPr>
-            <w:r>
-              <w:rPr>
-                <w:rFonts w:ascii="Source Sans Pro" w:hAnsi="Source Sans Pro"/>
-              </w:rPr>
-              <w:t>University of Glasgow</w:t>
-            </w:r>
-          </w:p>
-          <w:p>
-            <w:pPr>
-              <w:rPr>
-                <w:rFonts w:ascii="Source Sans Pro" w:hAnsi="Source Sans Pro"/>
-              </w:rPr>
-            </w:pPr>
-            <w:r>
-              <w:rPr>
-                <w:rFonts w:ascii="Source Sans Pro" w:hAnsi="Source Sans Pro"/>
-              </w:rPr>
-              <w:t>Supervised by Martin Lages. A three-month role developing learning aids for advanced statistics for the School of Psychology. This was done primarily using R Markdown and Shiny.</w:t>
-            </w:r>
           </w:p>
         </w:tc>
       </w:tr>
     </w:tbl>
     <w:p>
+      <w:r>
+        <w:br w:type="page"/>
+      </w:r>
+    </w:p>
+    <w:tbl>
+      <w:tblPr>
+        <w:tblStyle w:val="TableGrid"/>
+        <w:tblW w:w="0" w:type="auto"/>
+        <w:tblInd w:w="-113" w:type="dxa"/>
+        <w:tblBorders>
+          <w:top w:val="none" w:sz="0" w:space="0" w:color="auto"/>
+          <w:left w:val="none" w:sz="0" w:space="0" w:color="auto"/>
+          <w:bottom w:val="none" w:sz="0" w:space="0" w:color="auto"/>
+          <w:right w:val="none" w:sz="0" w:space="0" w:color="auto"/>
+          <w:insideH w:val="none" w:sz="0" w:space="0" w:color="auto"/>
+          <w:insideV w:val="none" w:sz="0" w:space="0" w:color="auto"/>
+        </w:tblBorders>
+        <w:tblLook w:val="04A0" w:firstRow="1" w:lastRow="0" w:firstColumn="1" w:lastColumn="0" w:noHBand="0" w:noVBand="1"/>
+      </w:tblPr>
+      <w:tblGrid>
+        <w:gridCol w:w="1588"/>
+        <w:gridCol w:w="7343"/>
+      </w:tblGrid>
+      <w:tr>
+        <w:tc>
+          <w:tcPr>
+            <w:tcW w:w="1588" w:type="dxa"/>
+          </w:tcPr>
+          <w:p>
+            <w:pPr>
+              <w:rPr>
+                <w:rFonts w:ascii="Source Sans Pro" w:hAnsi="Source Sans Pro"/>
+              </w:rPr>
+            </w:pPr>
+            <w:r>
+              <w:rPr>
+                <w:rFonts w:ascii="Source Sans Pro" w:hAnsi="Source Sans Pro"/>
+              </w:rPr>
+              <w:lastRenderedPageBreak/>
+              <w:t xml:space="preserve">2020 </w:t>
+            </w:r>
+            <w:r>
+              <w:rPr>
+                <w:rFonts w:ascii="Source Sans Pro" w:hAnsi="Source Sans Pro"/>
+              </w:rPr>
+              <w:t xml:space="preserve">– </w:t>
+            </w:r>
+            <w:r>
+              <w:rPr>
+                <w:rFonts w:ascii="Source Sans Pro" w:hAnsi="Source Sans Pro"/>
+              </w:rPr>
+              <w:t>2022</w:t>
+            </w:r>
+          </w:p>
+        </w:tc>
+        <w:tc>
+          <w:tcPr>
+            <w:tcW w:w="7343" w:type="dxa"/>
+          </w:tcPr>
+          <w:p>
+            <w:pPr>
+              <w:rPr>
+                <w:rFonts w:ascii="Source Sans Pro" w:hAnsi="Source Sans Pro"/>
+              </w:rPr>
+            </w:pPr>
+            <w:r>
+              <w:rPr>
+                <w:rFonts w:ascii="Source Sans Pro" w:hAnsi="Source Sans Pro"/>
+              </w:rPr>
+              <w:t>Academic Communities Coordinator</w:t>
+            </w:r>
+            <w:r>
+              <w:rPr>
+                <w:rFonts w:ascii="Source Sans Pro" w:hAnsi="Source Sans Pro"/>
+              </w:rPr>
+              <w:br/>
+              <w:t>Sublime Digital Ltd.</w:t>
+            </w:r>
+          </w:p>
+          <w:p>
+            <w:pPr>
+              <w:rPr>
+                <w:rFonts w:ascii="Source Sans Pro" w:hAnsi="Source Sans Pro"/>
+              </w:rPr>
+            </w:pPr>
+            <w:r>
+              <w:rPr>
+                <w:rFonts w:ascii="Source Sans Pro" w:hAnsi="Source Sans Pro"/>
+              </w:rPr>
+              <w:t xml:space="preserve">Managed academic stakeholders in the development of a VR teaching platform using planned events and personal communications. </w:t>
+            </w:r>
+            <w:r>
+              <w:rPr>
+                <w:rFonts w:ascii="Source Sans Pro" w:hAnsi="Source Sans Pro"/>
+              </w:rPr>
+              <w:br/>
+            </w:r>
+          </w:p>
+        </w:tc>
+      </w:tr>
+      <w:tr>
+        <w:tc>
+          <w:tcPr>
+            <w:tcW w:w="1588" w:type="dxa"/>
+          </w:tcPr>
+          <w:p>
+            <w:pPr>
+              <w:rPr>
+                <w:rFonts w:ascii="Source Sans Pro" w:hAnsi="Source Sans Pro"/>
+              </w:rPr>
+            </w:pPr>
+            <w:r>
+              <w:rPr>
+                <w:rFonts w:ascii="Source Sans Pro" w:hAnsi="Source Sans Pro"/>
+              </w:rPr>
+              <w:t xml:space="preserve">2020 </w:t>
+            </w:r>
+            <w:r>
+              <w:rPr>
+                <w:rFonts w:ascii="Source Sans Pro" w:hAnsi="Source Sans Pro"/>
+              </w:rPr>
+              <w:t xml:space="preserve">– </w:t>
+            </w:r>
+            <w:r>
+              <w:rPr>
+                <w:rFonts w:ascii="Source Sans Pro" w:hAnsi="Source Sans Pro"/>
+              </w:rPr>
+              <w:t>2021</w:t>
+            </w:r>
+          </w:p>
+        </w:tc>
+        <w:tc>
+          <w:tcPr>
+            <w:tcW w:w="7343" w:type="dxa"/>
+          </w:tcPr>
+          <w:p>
+            <w:pPr>
+              <w:rPr>
+                <w:rFonts w:ascii="Source Sans Pro" w:hAnsi="Source Sans Pro"/>
+              </w:rPr>
+            </w:pPr>
+            <w:r>
+              <w:rPr>
+                <w:rFonts w:ascii="Source Sans Pro" w:hAnsi="Source Sans Pro"/>
+              </w:rPr>
+              <w:t>Demonstrator</w:t>
+            </w:r>
+          </w:p>
+          <w:p>
+            <w:pPr>
+              <w:rPr>
+                <w:rFonts w:ascii="Source Sans Pro" w:hAnsi="Source Sans Pro"/>
+              </w:rPr>
+            </w:pPr>
+            <w:r>
+              <w:rPr>
+                <w:rFonts w:ascii="Source Sans Pro" w:hAnsi="Source Sans Pro"/>
+              </w:rPr>
+              <w:t>University of Glasgow</w:t>
+            </w:r>
+          </w:p>
+          <w:p>
+            <w:pPr>
+              <w:rPr>
+                <w:rFonts w:ascii="Source Sans Pro" w:hAnsi="Source Sans Pro"/>
+              </w:rPr>
+            </w:pPr>
+            <w:r>
+              <w:rPr>
+                <w:rFonts w:ascii="Source Sans Pro" w:hAnsi="Source Sans Pro"/>
+              </w:rPr>
+              <w:t>Supervised by Martin Lages. A three-month role developing learning aids for advanced statistics for the School of Psychology. This was done primarily using R Markdown and Shiny.</w:t>
+            </w:r>
+          </w:p>
+        </w:tc>
+      </w:tr>
+    </w:tbl>
+    <w:p>
       <w:pPr>
         <w:pStyle w:val="Heading1"/>
       </w:pPr>
       <w:r>
-        <w:lastRenderedPageBreak/>
         <w:t>Academic</w:t>
       </w:r>
       <w:r>
@@ -2810,13 +3055,13 @@
               <w:rPr>
                 <w:rFonts w:ascii="Source Sans Pro" w:hAnsi="Source Sans Pro"/>
               </w:rPr>
-              <w:t xml:space="preserve"> p</w:t>
-            </w:r>
-            <w:r>
-              <w:rPr>
-                <w:rFonts w:ascii="Source Sans Pro" w:hAnsi="Source Sans Pro"/>
-              </w:rPr>
-              <w:t>resent</w:t>
+              <w:t xml:space="preserve"> </w:t>
+            </w:r>
+            <w:r>
+              <w:rPr>
+                <w:rFonts w:ascii="Source Sans Pro" w:hAnsi="Source Sans Pro"/>
+              </w:rPr>
+              <w:t>2023</w:t>
             </w:r>
           </w:p>
         </w:tc>
@@ -2866,7 +3111,13 @@
               <w:rPr>
                 <w:rFonts w:ascii="Source Sans Pro" w:hAnsi="Source Sans Pro"/>
               </w:rPr>
-              <w:t xml:space="preserve"> present</w:t>
+              <w:t xml:space="preserve"> </w:t>
+            </w:r>
+            <w:r>
+              <w:rPr>
+                <w:rFonts w:ascii="Source Sans Pro" w:hAnsi="Source Sans Pro"/>
+              </w:rPr>
+              <w:t>2023</w:t>
             </w:r>
           </w:p>
         </w:tc>
@@ -3155,7 +3406,7 @@
         </w:rPr>
         <w:br/>
       </w:r>
-      <w:hyperlink r:id="rId18" w:history="1">
+      <w:hyperlink r:id="rId19" w:history="1">
         <w:r>
           <w:rPr>
             <w:rStyle w:val="Hyperlink"/>
@@ -3214,7 +3465,7 @@
         </w:rPr>
         <w:br/>
       </w:r>
-      <w:hyperlink r:id="rId19" w:history="1">
+      <w:hyperlink r:id="rId20" w:history="1">
         <w:r>
           <w:rPr>
             <w:rStyle w:val="Hyperlink"/>
@@ -3296,7 +3547,7 @@
         </w:rPr>
         <w:br/>
       </w:r>
-      <w:hyperlink r:id="rId20" w:history="1">
+      <w:hyperlink r:id="rId21" w:history="1">
         <w:r>
           <w:rPr>
             <w:rStyle w:val="Hyperlink"/>
@@ -3307,7 +3558,7 @@
       </w:hyperlink>
     </w:p>
     <w:sectPr>
-      <w:footerReference w:type="default" r:id="rId21"/>
+      <w:footerReference w:type="default" r:id="rId22"/>
       <w:pgSz w:w="11906" w:h="16838"/>
       <w:pgMar w:top="1440" w:right="1440" w:bottom="1440" w:left="1440" w:header="708" w:footer="708" w:gutter="0"/>
       <w:cols w:space="708"/>
@@ -4755,6 +5006,25 @@
 </file>
 
 <file path=customXml/item1.xml><?xml version="1.0" encoding="utf-8"?>
+<b:Sources xmlns:b="http://schemas.openxmlformats.org/officeDocument/2006/bibliography" xmlns="http://schemas.openxmlformats.org/officeDocument/2006/bibliography" SelectedStyle="\APASixthEditionOfficeOnline.xsl" StyleName="APA" Version="6"/>
+</file>
+
+<file path=customXml/item2.xml><?xml version="1.0" encoding="utf-8"?>
+<?mso-contentType ?>
+<FormTemplates xmlns="http://schemas.microsoft.com/sharepoint/v3/contenttype/forms">
+  <Display>DocumentLibraryForm</Display>
+  <Edit>DocumentLibraryForm</Edit>
+  <New>DocumentLibraryForm</New>
+</FormTemplates>
+</file>
+
+<file path=customXml/item3.xml><?xml version="1.0" encoding="utf-8"?>
+<p:properties xmlns:p="http://schemas.microsoft.com/office/2006/metadata/properties" xmlns:xsi="http://www.w3.org/2001/XMLSchema-instance" xmlns:pc="http://schemas.microsoft.com/office/infopath/2007/PartnerControls">
+  <documentManagement/>
+</p:properties>
+</file>
+
+<file path=customXml/item4.xml><?xml version="1.0" encoding="utf-8"?>
 <ct:contentTypeSchema xmlns:ct="http://schemas.microsoft.com/office/2006/metadata/contentType" xmlns:ma="http://schemas.microsoft.com/office/2006/metadata/properties/metaAttributes" ct:_="" ma:_="" ma:contentTypeName="Document" ma:contentTypeID="0x0101004E0AC046D158EE4DB937DA9A56D27D1C" ma:contentTypeVersion="10" ma:contentTypeDescription="Create a new document." ma:contentTypeScope="" ma:versionID="f1b105e6b9cff91feb409560dbf6f7aa">
   <xsd:schema xmlns:xsd="http://www.w3.org/2001/XMLSchema" xmlns:xs="http://www.w3.org/2001/XMLSchema" xmlns:p="http://schemas.microsoft.com/office/2006/metadata/properties" xmlns:ns3="b24ac480-a0b1-4388-a6cd-cfb001cdf6c7" xmlns:ns4="e7d8f92c-3952-4b7d-acc4-88cf8f2f7888" targetNamespace="http://schemas.microsoft.com/office/2006/metadata/properties" ma:root="true" ma:fieldsID="8ce9a1263d385fff90f75fc0f277280b" ns3:_="" ns4:_="">
     <xsd:import namespace="b24ac480-a0b1-4388-a6cd-cfb001cdf6c7"/>
@@ -4957,26 +5227,32 @@
 </ct:contentTypeSchema>
 </file>
 
-<file path=customXml/item2.xml><?xml version="1.0" encoding="utf-8"?>
-<p:properties xmlns:p="http://schemas.microsoft.com/office/2006/metadata/properties" xmlns:xsi="http://www.w3.org/2001/XMLSchema-instance" xmlns:pc="http://schemas.microsoft.com/office/infopath/2007/PartnerControls">
-  <documentManagement/>
-</p:properties>
+<file path=customXml/itemProps1.xml><?xml version="1.0" encoding="utf-8"?>
+<ds:datastoreItem xmlns:ds="http://schemas.openxmlformats.org/officeDocument/2006/customXml" ds:itemID="{A9BA2174-033C-45ED-94FB-74A1FBFA3035}">
+  <ds:schemaRefs>
+    <ds:schemaRef ds:uri="http://schemas.openxmlformats.org/officeDocument/2006/bibliography"/>
+  </ds:schemaRefs>
+</ds:datastoreItem>
 </file>
 
-<file path=customXml/item3.xml><?xml version="1.0" encoding="utf-8"?>
-<?mso-contentType ?>
-<FormTemplates xmlns="http://schemas.microsoft.com/sharepoint/v3/contenttype/forms">
-  <Display>DocumentLibraryForm</Display>
-  <Edit>DocumentLibraryForm</Edit>
-  <New>DocumentLibraryForm</New>
-</FormTemplates>
+<file path=customXml/itemProps2.xml><?xml version="1.0" encoding="utf-8"?>
+<ds:datastoreItem xmlns:ds="http://schemas.openxmlformats.org/officeDocument/2006/customXml" ds:itemID="{4C53A478-4862-4699-9810-166E8FEE5B0D}">
+  <ds:schemaRefs>
+    <ds:schemaRef ds:uri="http://schemas.microsoft.com/sharepoint/v3/contenttype/forms"/>
+  </ds:schemaRefs>
+</ds:datastoreItem>
 </file>
 
-<file path=customXml/item4.xml><?xml version="1.0" encoding="utf-8"?>
-<b:Sources xmlns:b="http://schemas.openxmlformats.org/officeDocument/2006/bibliography" xmlns="http://schemas.openxmlformats.org/officeDocument/2006/bibliography" SelectedStyle="\APASixthEditionOfficeOnline.xsl" StyleName="APA" Version="6"/>
+<file path=customXml/itemProps3.xml><?xml version="1.0" encoding="utf-8"?>
+<ds:datastoreItem xmlns:ds="http://schemas.openxmlformats.org/officeDocument/2006/customXml" ds:itemID="{DD97F3C8-62EE-4BC5-A92B-F4DA5CE92DF8}">
+  <ds:schemaRefs>
+    <ds:schemaRef ds:uri="http://schemas.microsoft.com/office/2006/metadata/properties"/>
+    <ds:schemaRef ds:uri="http://schemas.microsoft.com/office/infopath/2007/PartnerControls"/>
+  </ds:schemaRefs>
+</ds:datastoreItem>
 </file>
 
-<file path=customXml/itemProps1.xml><?xml version="1.0" encoding="utf-8"?>
+<file path=customXml/itemProps4.xml><?xml version="1.0" encoding="utf-8"?>
 <ds:datastoreItem xmlns:ds="http://schemas.openxmlformats.org/officeDocument/2006/customXml" ds:itemID="{11E413AD-A691-4C16-BEE5-5C367C5D236C}">
   <ds:schemaRefs>
     <ds:schemaRef ds:uri="http://schemas.microsoft.com/office/2006/metadata/contentType"/>
@@ -4993,29 +5269,4 @@
     <ds:schemaRef ds:uri="http://schemas.microsoft.com/internal/obd"/>
   </ds:schemaRefs>
 </ds:datastoreItem>
-</file>
-
-<file path=customXml/itemProps2.xml><?xml version="1.0" encoding="utf-8"?>
-<ds:datastoreItem xmlns:ds="http://schemas.openxmlformats.org/officeDocument/2006/customXml" ds:itemID="{DD97F3C8-62EE-4BC5-A92B-F4DA5CE92DF8}">
-  <ds:schemaRefs>
-    <ds:schemaRef ds:uri="http://schemas.microsoft.com/office/2006/metadata/properties"/>
-    <ds:schemaRef ds:uri="http://schemas.microsoft.com/office/infopath/2007/PartnerControls"/>
-  </ds:schemaRefs>
-</ds:datastoreItem>
-</file>
-
-<file path=customXml/itemProps3.xml><?xml version="1.0" encoding="utf-8"?>
-<ds:datastoreItem xmlns:ds="http://schemas.openxmlformats.org/officeDocument/2006/customXml" ds:itemID="{4C53A478-4862-4699-9810-166E8FEE5B0D}">
-  <ds:schemaRefs>
-    <ds:schemaRef ds:uri="http://schemas.microsoft.com/sharepoint/v3/contenttype/forms"/>
-  </ds:schemaRefs>
-</ds:datastoreItem>
-</file>
-
-<file path=customXml/itemProps4.xml><?xml version="1.0" encoding="utf-8"?>
-<ds:datastoreItem xmlns:ds="http://schemas.openxmlformats.org/officeDocument/2006/customXml" ds:itemID="{A9BA2174-033C-45ED-94FB-74A1FBFA3035}">
-  <ds:schemaRefs>
-    <ds:schemaRef ds:uri="http://schemas.openxmlformats.org/officeDocument/2006/bibliography"/>
-  </ds:schemaRefs>
-</ds:datastoreItem>
 </file>
</xml_diff>

<commit_message>
rebuilding site Mon Aug 14 20:39:34 GMTST 2023
</commit_message>
<xml_diff>
--- a/files/cv.docx
+++ b/files/cv.docx
@@ -3739,28 +3739,25 @@
               <w:tab/>
             </w:r>
             <w:r>
+              <w:t>14</w:t>
+            </w:r>
+            <w:r>
+              <w:t>/</w:t>
+            </w:r>
+            <w:r>
               <w:t>0</w:t>
             </w:r>
             <w:r>
               <w:t>8</w:t>
             </w:r>
             <w:r>
-              <w:t>/</w:t>
-            </w:r>
-            <w:r>
-              <w:t>0</w:t>
-            </w:r>
-            <w:r>
-              <w:t>6</w:t>
-            </w:r>
-            <w:r>
               <w:t>/20</w:t>
             </w:r>
             <w:r>
               <w:t>2</w:t>
             </w:r>
             <w:r>
-              <w:t>2</w:t>
+              <w:t>3</w:t>
             </w:r>
           </w:sdtContent>
         </w:sdt>
@@ -5006,25 +5003,6 @@
 </file>
 
 <file path=customXml/item1.xml><?xml version="1.0" encoding="utf-8"?>
-<b:Sources xmlns:b="http://schemas.openxmlformats.org/officeDocument/2006/bibliography" xmlns="http://schemas.openxmlformats.org/officeDocument/2006/bibliography" SelectedStyle="\APASixthEditionOfficeOnline.xsl" StyleName="APA" Version="6"/>
-</file>
-
-<file path=customXml/item2.xml><?xml version="1.0" encoding="utf-8"?>
-<?mso-contentType ?>
-<FormTemplates xmlns="http://schemas.microsoft.com/sharepoint/v3/contenttype/forms">
-  <Display>DocumentLibraryForm</Display>
-  <Edit>DocumentLibraryForm</Edit>
-  <New>DocumentLibraryForm</New>
-</FormTemplates>
-</file>
-
-<file path=customXml/item3.xml><?xml version="1.0" encoding="utf-8"?>
-<p:properties xmlns:p="http://schemas.microsoft.com/office/2006/metadata/properties" xmlns:xsi="http://www.w3.org/2001/XMLSchema-instance" xmlns:pc="http://schemas.microsoft.com/office/infopath/2007/PartnerControls">
-  <documentManagement/>
-</p:properties>
-</file>
-
-<file path=customXml/item4.xml><?xml version="1.0" encoding="utf-8"?>
 <ct:contentTypeSchema xmlns:ct="http://schemas.microsoft.com/office/2006/metadata/contentType" xmlns:ma="http://schemas.microsoft.com/office/2006/metadata/properties/metaAttributes" ct:_="" ma:_="" ma:contentTypeName="Document" ma:contentTypeID="0x0101004E0AC046D158EE4DB937DA9A56D27D1C" ma:contentTypeVersion="10" ma:contentTypeDescription="Create a new document." ma:contentTypeScope="" ma:versionID="f1b105e6b9cff91feb409560dbf6f7aa">
   <xsd:schema xmlns:xsd="http://www.w3.org/2001/XMLSchema" xmlns:xs="http://www.w3.org/2001/XMLSchema" xmlns:p="http://schemas.microsoft.com/office/2006/metadata/properties" xmlns:ns3="b24ac480-a0b1-4388-a6cd-cfb001cdf6c7" xmlns:ns4="e7d8f92c-3952-4b7d-acc4-88cf8f2f7888" targetNamespace="http://schemas.microsoft.com/office/2006/metadata/properties" ma:root="true" ma:fieldsID="8ce9a1263d385fff90f75fc0f277280b" ns3:_="" ns4:_="">
     <xsd:import namespace="b24ac480-a0b1-4388-a6cd-cfb001cdf6c7"/>
@@ -5227,32 +5205,26 @@
 </ct:contentTypeSchema>
 </file>
 
-<file path=customXml/itemProps1.xml><?xml version="1.0" encoding="utf-8"?>
-<ds:datastoreItem xmlns:ds="http://schemas.openxmlformats.org/officeDocument/2006/customXml" ds:itemID="{A9BA2174-033C-45ED-94FB-74A1FBFA3035}">
-  <ds:schemaRefs>
-    <ds:schemaRef ds:uri="http://schemas.openxmlformats.org/officeDocument/2006/bibliography"/>
-  </ds:schemaRefs>
-</ds:datastoreItem>
+<file path=customXml/item2.xml><?xml version="1.0" encoding="utf-8"?>
+<p:properties xmlns:p="http://schemas.microsoft.com/office/2006/metadata/properties" xmlns:xsi="http://www.w3.org/2001/XMLSchema-instance" xmlns:pc="http://schemas.microsoft.com/office/infopath/2007/PartnerControls">
+  <documentManagement/>
+</p:properties>
 </file>
 
-<file path=customXml/itemProps2.xml><?xml version="1.0" encoding="utf-8"?>
-<ds:datastoreItem xmlns:ds="http://schemas.openxmlformats.org/officeDocument/2006/customXml" ds:itemID="{4C53A478-4862-4699-9810-166E8FEE5B0D}">
-  <ds:schemaRefs>
-    <ds:schemaRef ds:uri="http://schemas.microsoft.com/sharepoint/v3/contenttype/forms"/>
-  </ds:schemaRefs>
-</ds:datastoreItem>
+<file path=customXml/item3.xml><?xml version="1.0" encoding="utf-8"?>
+<?mso-contentType ?>
+<FormTemplates xmlns="http://schemas.microsoft.com/sharepoint/v3/contenttype/forms">
+  <Display>DocumentLibraryForm</Display>
+  <Edit>DocumentLibraryForm</Edit>
+  <New>DocumentLibraryForm</New>
+</FormTemplates>
 </file>
 
-<file path=customXml/itemProps3.xml><?xml version="1.0" encoding="utf-8"?>
-<ds:datastoreItem xmlns:ds="http://schemas.openxmlformats.org/officeDocument/2006/customXml" ds:itemID="{DD97F3C8-62EE-4BC5-A92B-F4DA5CE92DF8}">
-  <ds:schemaRefs>
-    <ds:schemaRef ds:uri="http://schemas.microsoft.com/office/2006/metadata/properties"/>
-    <ds:schemaRef ds:uri="http://schemas.microsoft.com/office/infopath/2007/PartnerControls"/>
-  </ds:schemaRefs>
-</ds:datastoreItem>
+<file path=customXml/item4.xml><?xml version="1.0" encoding="utf-8"?>
+<b:Sources xmlns:b="http://schemas.openxmlformats.org/officeDocument/2006/bibliography" xmlns="http://schemas.openxmlformats.org/officeDocument/2006/bibliography" SelectedStyle="\APASixthEditionOfficeOnline.xsl" StyleName="APA" Version="6"/>
 </file>
 
-<file path=customXml/itemProps4.xml><?xml version="1.0" encoding="utf-8"?>
+<file path=customXml/itemProps1.xml><?xml version="1.0" encoding="utf-8"?>
 <ds:datastoreItem xmlns:ds="http://schemas.openxmlformats.org/officeDocument/2006/customXml" ds:itemID="{11E413AD-A691-4C16-BEE5-5C367C5D236C}">
   <ds:schemaRefs>
     <ds:schemaRef ds:uri="http://schemas.microsoft.com/office/2006/metadata/contentType"/>
@@ -5269,4 +5241,29 @@
     <ds:schemaRef ds:uri="http://schemas.microsoft.com/internal/obd"/>
   </ds:schemaRefs>
 </ds:datastoreItem>
+</file>
+
+<file path=customXml/itemProps2.xml><?xml version="1.0" encoding="utf-8"?>
+<ds:datastoreItem xmlns:ds="http://schemas.openxmlformats.org/officeDocument/2006/customXml" ds:itemID="{DD97F3C8-62EE-4BC5-A92B-F4DA5CE92DF8}">
+  <ds:schemaRefs>
+    <ds:schemaRef ds:uri="http://schemas.microsoft.com/office/2006/metadata/properties"/>
+    <ds:schemaRef ds:uri="http://schemas.microsoft.com/office/infopath/2007/PartnerControls"/>
+  </ds:schemaRefs>
+</ds:datastoreItem>
+</file>
+
+<file path=customXml/itemProps3.xml><?xml version="1.0" encoding="utf-8"?>
+<ds:datastoreItem xmlns:ds="http://schemas.openxmlformats.org/officeDocument/2006/customXml" ds:itemID="{4C53A478-4862-4699-9810-166E8FEE5B0D}">
+  <ds:schemaRefs>
+    <ds:schemaRef ds:uri="http://schemas.microsoft.com/sharepoint/v3/contenttype/forms"/>
+  </ds:schemaRefs>
+</ds:datastoreItem>
+</file>
+
+<file path=customXml/itemProps4.xml><?xml version="1.0" encoding="utf-8"?>
+<ds:datastoreItem xmlns:ds="http://schemas.openxmlformats.org/officeDocument/2006/customXml" ds:itemID="{A9BA2174-033C-45ED-94FB-74A1FBFA3035}">
+  <ds:schemaRefs>
+    <ds:schemaRef ds:uri="http://schemas.openxmlformats.org/officeDocument/2006/bibliography"/>
+  </ds:schemaRefs>
+</ds:datastoreItem>
 </file>
</xml_diff>